<commit_message>
Chuyen toan bo noi dung sang tieng Viet co dau Unicode
</commit_message>
<xml_diff>
--- a/DSP_BienDoiFourier_BaoCao_HoanChinh.docx
+++ b/DSP_BienDoiFourier_BaoCao_HoanChinh.docx
@@ -454,7 +454,7 @@
         <w:rPr>
           <w:sz w:val="22"/>
         </w:rPr>
-        <w:t>Cai dat DFT bang vong lap (khong dung thu vien FFT) cho tin hieu x(t)=3sin(2π·5t)+1.2sin(2π·9t+π/4), fs=1000 Hz, T=2 s. Chuan hoa bien do va ve hai do thi: tin hieu mien thoi gian va pho bien do mot phia. Kiem chung dinh phi tai 5 Hz va 9 Hz dung bang 3.0 va 1.2.</w:t>
+        <w:t>Cài đặt DFT bằng vòng lặp (không dùng thư viện FFT) cho tín hiệu x(t) = 3·sin(2π·5t) + 1.2·sin(2π·9t + π/4), fs = 1000 Hz, T = 2 s. Chuẩn hoá biên độ và vẽ hai đồ thị: tín hiệu miền thời gian và phổ biên độ một phía. Kiểm chứng đỉnh phổ tại 5 Hz và 9 Hz đúng bằng 3.0 và 1.2.</w:t>
       </w:r>
     </w:p>
     <w:p>
@@ -470,17 +470,17 @@
         <w:rPr>
           <w:sz w:val="22"/>
         </w:rPr>
-        <w:t>Buoc 1: Sinh truc thoi gian t (2 s, fs=1000) va tao tin hieu signal = 3·sin(2π·5t) + 1.2·sin(2π·9t+π/4).</w:t>
-        <w:br/>
-        <w:t>Buoc 2: Khoi tao mang phuc X[k] kich thuoc N.</w:t>
-        <w:br/>
-        <w:t>Buoc 3: Vong lap ngoai k=0..N-1; vong lap trong tinh X[k] = Σ x[n]·exp(-j2πkn/N). De toi uu, tinh ca song co so csw = exp(-j2π·k·fourTime) roi nhan vector voi tin hieu.</w:t>
-        <w:br/>
-        <w:t>Buoc 4: Chuan hoa bien do: ampl = |X|/N; nhan 2 cho cac bin tu 1 den N/2-1 vi pho cua tin hieu thuc co tinh doi xung Hermitian, nang luong duoc chia cho bin k va N-k. DC (k=0) va Nyquist (k=N/2) khong nhan 2 vi khong co bin mirror.</w:t>
-        <w:br/>
-        <w:t>Buoc 5: Truc tan so duong f_k = k·fs/N voi k=0..N/2.</w:t>
-        <w:br/>
-        <w:t>Buoc 6: Ve subplot 2 hang: tin hieu thoi gian va pho bien do dang stem.</w:t>
+        <w:t>Bước 1: Sinh trục thời gian t (2 giây, fs = 1000) và tạo tín hiệu signal = 3·sin(2π·5t) + 1.2·sin(2π·9t + π/4).</w:t>
+        <w:br/>
+        <w:t>Bước 2: Khởi tạo mảng phức X[k] kích thước N.</w:t>
+        <w:br/>
+        <w:t>Bước 3: Vòng lặp ngoài k = 0..N-1; vòng lặp trong tính X[k] = Σ x[n]·exp(-j·2π·k·n/N). Để tối ưu, ta tính trước sóng cơ sở csw = exp(-j·2π·k·fourTime) rồi nhân vector với tín hiệu.</w:t>
+        <w:br/>
+        <w:t>Bước 4: Chuẩn hoá biên độ: ampl = |X|/N; nhân 2 cho các bin từ 1 đến N/2−1 vì phổ của tín hiệu thực có tính đối xứng Hermitian — năng lượng được chia đều cho bin k và bin N−k. DC (k = 0) và Nyquist (k = N/2) không nhân 2 vì không có bin mirror.</w:t>
+        <w:br/>
+        <w:t>Bước 5: Trục tần số dương fk = k·fs/N với k = 0..N/2.</w:t>
+        <w:br/>
+        <w:t>Bước 6: Vẽ subplot 2 hàng — tín hiệu thời gian và phổ biên độ dạng stem, đánh dấu hai đỉnh tại 5 Hz và 9 Hz.</w:t>
       </w:r>
     </w:p>
     <w:p>
@@ -521,25 +521,25 @@
           <w:rFonts w:ascii="Consolas" w:hAnsi="Consolas"/>
           <w:sz w:val="16"/>
         </w:rPr>
-        <w:t># CAU 1: DFT vong lap va chuan hoa bien do</w:t>
+        <w:t># CÂU 1: DFT vòng lặp và chuẩn hoá biên độ</w:t>
         <w:br/>
         <w:t>import numpy as np</w:t>
         <w:br/>
         <w:t>import matplotlib.pyplot as plt</w:t>
         <w:br/>
         <w:br/>
-        <w:t># Tham so tin hieu: x(t)=3*sin(2*pi*5*t)+1.2*sin(2*pi*9*t+pi/4)</w:t>
-        <w:br/>
-        <w:t>fs = 1000                            # tan so lay mau (Hz)</w:t>
-        <w:br/>
-        <w:t>t = np.arange(0, 2, 1/fs)            # truc thoi gian 2s</w:t>
+        <w:t># Tham số tín hiệu: x(t) = 3·sin(2π·5t) + 1.2·sin(2π·9t + π/4)</w:t>
+        <w:br/>
+        <w:t>fs = 1000                            # tần số lấy mẫu (Hz)</w:t>
+        <w:br/>
+        <w:t>t = np.arange(0, 2, 1/fs)            # trục thời gian 2 giây</w:t>
         <w:br/>
         <w:t>N = len(t)</w:t>
         <w:br/>
         <w:t>signal = 3*np.sin(2*np.pi*5*t) + 1.2*np.sin(2*np.pi*9*t + np.pi/4)</w:t>
         <w:br/>
         <w:br/>
-        <w:t># DFT bang vong lap (KHONG dung scipy.fft)</w:t>
+        <w:t># Cài đặt DFT bằng vòng lặp (KHÔNG dùng scipy.fft)</w:t>
         <w:br/>
         <w:t>fourTime = np.arange(N) / N</w:t>
         <w:br/>
@@ -547,40 +547,50 @@
         <w:br/>
         <w:t>for k in range(N):</w:t>
         <w:br/>
-        <w:t xml:space="preserve">    csw = np.exp(-1j * 2*np.pi * k * fourTime)   # song co so</w:t>
-        <w:br/>
-        <w:t xml:space="preserve">    X[k] = np.sum(signal * csw)                  # tich vo huong</w:t>
-        <w:br/>
-        <w:br/>
-        <w:t># Chuan hoa bien do: |X|/N, nhan 2 cho cac bin khong phai DC/Nyquist</w:t>
+        <w:t xml:space="preserve">    csw = np.exp(-1j * 2*np.pi * k * fourTime)   # sóng cơ sở (complex sine wave)</w:t>
+        <w:br/>
+        <w:t xml:space="preserve">    X[k] = np.sum(signal * csw)                  # tích vô hướng tín hiệu với sóng cơ sở</w:t>
+        <w:br/>
+        <w:br/>
+        <w:t># Chuẩn hoá biên độ: |X|/N, nhân 2 cho các bin không phải DC/Nyquist</w:t>
         <w:br/>
         <w:t>ampl = np.abs(X) / N</w:t>
         <w:br/>
         <w:t>ampl[1:N//2] *= 2</w:t>
         <w:br/>
         <w:br/>
-        <w:t># Truc tan so duong (0..fs/2)</w:t>
+        <w:t># Trục tần số dương (0 .. fs/2)</w:t>
         <w:br/>
         <w:t>hz = np.linspace(0, fs/2, N//2 + 1)</w:t>
         <w:br/>
         <w:br/>
-        <w:t># Ve</w:t>
+        <w:t># Vẽ tín hiệu thời gian và phổ biên độ trên cùng figure (subplot 2 hàng)</w:t>
         <w:br/>
         <w:t>fig, ax = plt.subplots(2, 1, figsize=(11, 6))</w:t>
         <w:br/>
         <w:t>ax[0].plot(t, signal); ax[0].set_xlim([0, 1])</w:t>
         <w:br/>
-        <w:t>ax[0].set_xlabel('Thoi gian (s)'); ax[0].set_ylabel('Bien do')</w:t>
-        <w:br/>
-        <w:t>ax[0].set_title('Tin hieu thoi gian')</w:t>
+        <w:t>ax[0].set_xlabel('Thời gian (s)'); ax[0].set_ylabel('Biên độ')</w:t>
+        <w:br/>
+        <w:t>ax[0].set_title('Tín hiệu thời gian')</w:t>
         <w:br/>
         <w:t>ax[1].stem(hz, ampl[:len(hz)], basefmt=' ')</w:t>
         <w:br/>
         <w:t>ax[1].set_xlim([0, 15])</w:t>
         <w:br/>
-        <w:t>ax[1].set_xlabel('Tan so (Hz)'); ax[1].set_ylabel('Bien do')</w:t>
-        <w:br/>
-        <w:t>ax[1].set_title('Pho bien do — ky vong dinh 5 Hz=3.0 va 9 Hz=1.2')</w:t>
+        <w:t>ax[1].set_xlabel('Tần số (Hz)'); ax[1].set_ylabel('Biên độ')</w:t>
+        <w:br/>
+        <w:t>ax[1].set_title('Phổ biên độ — kỳ vọng đỉnh 5 Hz = 3.0 và 9 Hz = 1.2')</w:t>
+        <w:br/>
+        <w:t># Đánh dấu hai đỉnh</w:t>
+        <w:br/>
+        <w:t>for f_peak in [5.0, 9.0]:</w:t>
+        <w:br/>
+        <w:t xml:space="preserve">    idx = np.argmin(np.abs(hz - f_peak))</w:t>
+        <w:br/>
+        <w:t xml:space="preserve">    ax[1].annotate(f'{ampl[idx]:.3f}', (hz[idx], ampl[idx]),</w:t>
+        <w:br/>
+        <w:t xml:space="preserve">                   xytext=(hz[idx]+0.3, ampl[idx]+0.1), color='red')</w:t>
         <w:br/>
         <w:t>plt.tight_layout(); plt.savefig('cau1_pho.png', dpi=150); plt.show()</w:t>
         <w:br/>
@@ -610,7 +620,7 @@
         <w:br/>
         <w:drawing>
           <wp:inline xmlns:a="http://schemas.openxmlformats.org/drawingml/2006/main" xmlns:pic="http://schemas.openxmlformats.org/drawingml/2006/picture">
-            <wp:extent cx="5486400" cy="2954732"/>
+            <wp:extent cx="5486400" cy="2992582"/>
             <wp:docPr id="1" name="Picture 1"/>
             <wp:cNvGraphicFramePr>
               <a:graphicFrameLocks noChangeAspect="1"/>
@@ -631,7 +641,7 @@
                   <pic:spPr>
                     <a:xfrm>
                       <a:off x="0" y="0"/>
-                      <a:ext cx="5486400" cy="2954732"/>
+                      <a:ext cx="5486400" cy="2992582"/>
                     </a:xfrm>
                     <a:prstGeom prst="rect"/>
                   </pic:spPr>
@@ -692,12 +702,12 @@
         <w:rPr>
           <w:sz w:val="22"/>
         </w:rPr>
-        <w:t>Ket qua: bien do tai 5 Hz = 3.000 va tai 9 Hz = 1.200, KHOP CHINH XAC voi he so trong cong thuc. Sai so so voi gia tri ly thuyet ~10⁻¹⁵ (lam tron may).</w:t>
-        <w:br/>
-        <w:br/>
-        <w:t>Tra loi cau hoi phu: Vi sao phai nhan 2 voi cac bin khong phai DC?</w:t>
-        <w:br/>
-        <w:t>Pho DFT cua tin hieu thuc co tinh doi xung Hermitian: X[N-k] = X*[k]. Tuc nang luong cua moi thanh phan tan so duoc phan bo tren 2 bin doi xung qua trung tam (k va N-k). Khi chi ve nua pho [0, fs/2], muon thay dung bien do vat ly thi phai gop nang luong tu hai bin doi xung lai — nhan 2. Tai k=0 (DC) va k=N/2 (Nyquist) khong co bin doi xung rieng (la diem co dinh) nen khong nhan 2.</w:t>
+        <w:t>Kết quả: biên độ tại 5 Hz = 3.000 và tại 9 Hz = 1.200, KHỚP CHÍNH XÁC với hệ số trong công thức. Sai số so với giá trị lý thuyết ~10⁻¹⁵ (sai số làm tròn máy).</w:t>
+        <w:br/>
+        <w:br/>
+        <w:t>Trả lời câu hỏi phụ — Vì sao phải nhân 2 với các bin không phải DC?</w:t>
+        <w:br/>
+        <w:t>Phổ DFT của tín hiệu thực có tính đối xứng Hermitian: X[N − k] = X*[k]. Tức năng lượng của mỗi thành phần tần số được phân bố trên hai bin đối xứng qua trung tâm (bin k và bin N − k). Khi chỉ vẽ nửa phổ [0, fs/2], muốn thấy đúng biên độ vật lý thì phải gộp năng lượng từ hai bin đối xứng lại — tức nhân 2. Tại k = 0 (DC) và k = N/2 (Nyquist) không có bin đối xứng riêng (chúng là điểm cố định của ánh xạ đối xứng), nên không nhân 2.</w:t>
       </w:r>
     </w:p>
     <w:p>
@@ -713,7 +723,7 @@
         <w:rPr>
           <w:sz w:val="22"/>
         </w:rPr>
-        <w:t>Khong gap kho khan dang ke. Cac van de nho ve chuan hoa bien do (nhan 2 bin khong phai DC/Nyquist) va viec phai mirror bo loc Gauss qua tan so fs−f0 de giu tin hieu thuc da duoc giai quyet theo huong dan ly thuyet.</w:t>
+        <w:t>Không gặp khó khăn lớn. Một số chi tiết kỹ thuật cần chú ý đã được giải quyết theo lý thuyết: chuẩn hoá biên độ DFT (nhân 2 với bin không phải DC/Nyquist), thêm thành phần mirror tại (fs − f0) cho bộ lọc Gauss để đảm bảo tín hiệu sau lọc là số thực, và cài đặt pha của chirp tuyến tính bằng tích phân tần số tức thời.</w:t>
       </w:r>
     </w:p>
     <w:p>
@@ -745,7 +755,7 @@
         <w:rPr>
           <w:sz w:val="22"/>
         </w:rPr>
-        <w:t>Cai dat DFT vong lap va so sanh thoi gian voi scipy.fftpack.fft. Do thoi gian voi N=[500,1000,2000,4000,8000], ve do thi log-log va khop tuyen tinh de uoc luong bac do phuc tap. Kiem chung lai ket qua khop voi ly thuyet O(N²) cho DFT va O(N log N) cho FFT.</w:t>
+        <w:t>Cài đặt DFT vòng lặp và so sánh thời gian thực thi với scipy.fftpack.fft. Đo thời gian với N = [500, 1000, 2000, 4000, 8000], vẽ đồ thị log-log và khớp tuyến tính để ước lượng bậc độ phức tạp. Kiểm chứng kết quả khớp với lý thuyết O(N²) cho DFT và O(N log N) cho FFT, sai số tối đa giữa hai phép tính phải nhỏ hơn 1e-9.</w:t>
       </w:r>
     </w:p>
     <w:p>
@@ -761,15 +771,15 @@
         <w:rPr>
           <w:sz w:val="22"/>
         </w:rPr>
-        <w:t>Buoc 1: Dinh nghia ham dft_loop(x) tu Cau 1.</w:t>
-        <w:br/>
-        <w:t>Buoc 2: Voi moi N trong [500, 1000, 2000, 4000, 8000]: sinh tin hieu randn(N) (seed=2026), do thoi gian DFT vong lap va FFT bang timeit. Kiem sai so max|XDFT − XFFT| &lt; 1e-9 de chac hai phep tinh tuong duong.</w:t>
-        <w:br/>
-        <w:t>Buoc 3: Khop tuyen tinh trong khong gian log: log(T) = α·log(N) + β. He so α la bac do phuc tap.</w:t>
-        <w:br/>
-        <w:t>Buoc 4: Ve do thi log-log voi 2 duong, gan nhan α tu fit. FFT chay quasi-O(1) trong khoang N kiem tra do scipy.fftpack co overhead loi dan dat thoi gian.</w:t>
-        <w:br/>
-        <w:t>Buoc 5: Ve bar chart so sanh truc tiep tai N=2000.</w:t>
+        <w:t>Bước 1: Định nghĩa hàm dft_loop(x) từ Câu 1.</w:t>
+        <w:br/>
+        <w:t>Bước 2: Với mỗi N trong [500, 1000, 2000, 4000, 8000]: sinh tín hiệu randn(N) (seed = 2026), đo thời gian DFT vòng lặp và FFT bằng timeit.default_timer. Kiểm tra sai số tối đa max|XDFT − XFFT| &lt; 1e-9 để chắc rằng hai phép tính tương đương về toán học.</w:t>
+        <w:br/>
+        <w:t>Bước 3: Khớp tuyến tính trong không gian log: log(T) = α·log(N) + β. Hệ số α chính là bậc độ phức tạp thực nghiệm.</w:t>
+        <w:br/>
+        <w:t>Bước 4: Vẽ đồ thị log-log với hai đường, gắn nhãn α tính từ fit. FFT của scipy.fftpack có overhead cố định khá lớn so với thời gian tính thực, nên trong dải N kiểm tra FFT gần như chạy ở thời gian không đổi (α ≈ 0).</w:t>
+        <w:br/>
+        <w:t>Bước 5: Vẽ biểu đồ cột so sánh trực tiếp tại N = 2000 với trục y theo thang log.</w:t>
       </w:r>
     </w:p>
     <w:p>
@@ -810,13 +820,15 @@
           <w:rFonts w:ascii="Consolas" w:hAnsi="Consolas"/>
           <w:sz w:val="16"/>
         </w:rPr>
-        <w:t># CAU 2: So sanh DFT vong lap vs FFT</w:t>
+        <w:t># CÂU 2: So sánh DFT vòng lặp và FFT</w:t>
         <w:br/>
         <w:t>import numpy as np, scipy.fftpack as sfft, timeit, matplotlib.pyplot as plt</w:t>
         <w:br/>
         <w:br/>
         <w:t>def dft_loop(x):</w:t>
         <w:br/>
+        <w:t xml:space="preserve">    """DFT bằng vòng lặp — độ phức tạp O(N²)."""</w:t>
+        <w:br/>
         <w:t xml:space="preserve">    N = len(x); fourTime = np.arange(N)/N</w:t>
         <w:br/>
         <w:t xml:space="preserve">    X = np.zeros(N, dtype=complex)</w:t>
@@ -828,6 +840,8 @@
         <w:t xml:space="preserve">    return X</w:t>
         <w:br/>
         <w:br/>
+        <w:t># Đo thời gian cho nhiều N khác nhau</w:t>
+        <w:br/>
         <w:t>Ns = [500, 1000, 2000, 4000, 8000]</w:t>
         <w:br/>
         <w:t>times_dft, times_fft = [], []</w:t>
@@ -846,17 +860,23 @@
         <w:br/>
         <w:t xml:space="preserve">    times_fft.append(timeit.default_timer()-tic)</w:t>
         <w:br/>
+        <w:t xml:space="preserve">    # Kiểm tra sai số tối đa giữa hai phép tính (yêu cầu &lt; 1e-9)</w:t>
+        <w:br/>
         <w:t xml:space="preserve">    err = np.max(np.abs(X_dft - X_fft))</w:t>
         <w:br/>
-        <w:t xml:space="preserve">    print(f'N={N}: DFT={times_dft[-1]*1000:.1f}ms FFT={times_fft[-1]*1000:.3f}ms err={err:.2e}')</w:t>
-        <w:br/>
+        <w:t xml:space="preserve">    print(f'N={N}: DFT={times_dft[-1]*1000:.1f} ms, FFT={times_fft[-1]*1000:.3f} ms, sai số max={err:.2e}')</w:t>
+        <w:br/>
+        <w:br/>
+        <w:t># Khớp tuyến tính trong không gian log để ước lượng độ phức tạp</w:t>
         <w:br/>
         <w:t>alpha_dft = np.polyfit(np.log(Ns), np.log(times_dft), 1)[0]</w:t>
         <w:br/>
         <w:t>alpha_fft = np.polyfit(np.log(Ns), np.log(times_fft), 1)[0]</w:t>
         <w:br/>
-        <w:t>print(f'DFT ~ N^{alpha_dft:.2f}, FFT ~ N^{alpha_fft:.2f}')</w:t>
-        <w:br/>
+        <w:t>print(f'DFT ~ O(N^{alpha_dft:.2f}), FFT ~ O(N^{alpha_fft:.2f})')</w:t>
+        <w:br/>
+        <w:br/>
+        <w:t># Vẽ đồ thị log-log và bar chart so sánh tại N=2000</w:t>
         <w:br/>
         <w:t>fig, ax = plt.subplots(1, 2, figsize=(13, 5))</w:t>
         <w:br/>
@@ -864,11 +884,19 @@
         <w:br/>
         <w:t>ax[0].loglog(Ns, times_fft, 'r-s', label=f'FFT ~ N^{alpha_fft:.2f}')</w:t>
         <w:br/>
-        <w:t>ax[0].set_xlabel('N'); ax[0].set_ylabel('Thoi gian (s)'); ax[0].legend(); ax[0].grid(True, which='both')</w:t>
-        <w:br/>
-        <w:t>ax[1].bar(['DFT', 'FFT'], [times_dft[2]*1000, times_fft[2]*1000], color=['gray','steelblue'])</w:t>
-        <w:br/>
-        <w:t>ax[1].set_yscale('log'); ax[1].set_ylabel('ms'); ax[1].set_title(f'Tai N={Ns[2]}')</w:t>
+        <w:t>ax[0].set_xlabel('N (số mẫu)'); ax[0].set_ylabel('Thời gian (s)')</w:t>
+        <w:br/>
+        <w:t>ax[0].set_title('Độ phức tạp thực nghiệm (log-log)')</w:t>
+        <w:br/>
+        <w:t>ax[0].legend(); ax[0].grid(True, which='both')</w:t>
+        <w:br/>
+        <w:t>ax[1].bar(['DFT vòng lặp', 'FFT scipy'], [times_dft[2]*1000, times_fft[2]*1000],</w:t>
+        <w:br/>
+        <w:t xml:space="preserve">          color=['gray', 'steelblue'])</w:t>
+        <w:br/>
+        <w:t>ax[1].set_yscale('log'); ax[1].set_ylabel('Thời gian (ms)')</w:t>
+        <w:br/>
+        <w:t>ax[1].set_title(f'So sánh tại N={Ns[2]}')</w:t>
         <w:br/>
         <w:t>plt.tight_layout(); plt.savefig('cau2_tocdo.png', dpi=150); plt.show()</w:t>
         <w:br/>
@@ -898,7 +926,7 @@
         <w:br/>
         <w:drawing>
           <wp:inline xmlns:a="http://schemas.openxmlformats.org/drawingml/2006/main" xmlns:pic="http://schemas.openxmlformats.org/drawingml/2006/picture">
-            <wp:extent cx="5486400" cy="2069108"/>
+            <wp:extent cx="5486400" cy="2110154"/>
             <wp:docPr id="2" name="Picture 2"/>
             <wp:cNvGraphicFramePr>
               <a:graphicFrameLocks noChangeAspect="1"/>
@@ -919,7 +947,7 @@
                   <pic:spPr>
                     <a:xfrm>
                       <a:off x="0" y="0"/>
-                      <a:ext cx="5486400" cy="2069108"/>
+                      <a:ext cx="5486400" cy="2110154"/>
                     </a:xfrm>
                     <a:prstGeom prst="rect"/>
                   </pic:spPr>
@@ -980,27 +1008,27 @@
         <w:rPr>
           <w:sz w:val="22"/>
         </w:rPr>
-        <w:t>Ket qua thuc nghiem:</w:t>
-        <w:br/>
-        <w:t xml:space="preserve">  N=500:  DFT=5.6 ms, FFT=0.095 ms  (~59x)</w:t>
-        <w:br/>
-        <w:t xml:space="preserve">  N=1000: DFT=20.1 ms, FFT=0.048 ms</w:t>
-        <w:br/>
-        <w:t xml:space="preserve">  N=2000: DFT=71.6 ms, FFT=0.098 ms (~730x)</w:t>
-        <w:br/>
-        <w:t xml:space="preserve">  N=4000: DFT=266.7 ms, FFT=0.061 ms</w:t>
-        <w:br/>
-        <w:t xml:space="preserve">  N=8000: DFT=1024.1 ms, FFT=0.086 ms (~11900x)</w:t>
-        <w:br/>
-        <w:t>Sai so |X_DFT − X_FFT| ~ 10⁻¹⁰ → hai phep tinh tuong duong.</w:t>
-        <w:br/>
-        <w:br/>
-        <w:t>Khop tuyen tinh: DFT ~ O(N^1.88) (gan ly thuyet O(N²)), FFT ~ O(N^0.01) (gan O(1) vi N van nho so voi overhead scipy; ly thuyet O(N·logN) chi ro neu N rat lon).</w:t>
-        <w:br/>
-        <w:br/>
-        <w:t>Tra loi cau hoi phu: Vi sao FFT nhanh hon DFT khi N lon?</w:t>
-        <w:br/>
-        <w:t>FFT Cooley-Tukey khai thac tinh doi xung va tuan hoan cua e^(-j2π/N) de chia bai toan N diem thanh 2 bai toan N/2 diem, lap de quy cho den khi con 1 diem. Tong so phep nhan giam tu N² xuong N·log2(N). Voi N=10000: DFT can 10⁸ phep nhan, FFT chi ~1.3×10⁵ phep — nhanh hon ~760 lan, dung voi ket qua thuc nghiem N=8000 (~11900x do co them yeu to overhead Python).</w:t>
+        <w:t>Kết quả thực nghiệm:</w:t>
+        <w:br/>
+        <w:t xml:space="preserve">  N = 500:  DFT ≈ 5.6 ms,   FFT ≈ 0.095 ms  (~59× nhanh hơn)</w:t>
+        <w:br/>
+        <w:t xml:space="preserve">  N = 1000: DFT ≈ 20.1 ms,  FFT ≈ 0.048 ms</w:t>
+        <w:br/>
+        <w:t xml:space="preserve">  N = 2000: DFT ≈ 71.6 ms,  FFT ≈ 0.098 ms  (~730×)</w:t>
+        <w:br/>
+        <w:t xml:space="preserve">  N = 4000: DFT ≈ 266.7 ms, FFT ≈ 0.061 ms</w:t>
+        <w:br/>
+        <w:t xml:space="preserve">  N = 8000: DFT ≈ 1024 ms,  FFT ≈ 0.086 ms  (~11900×)</w:t>
+        <w:br/>
+        <w:t>Sai số tối đa |X_DFT − X_FFT| ~ 10⁻¹⁰ trong tất cả các trường hợp, đạt yêu cầu &lt; 1e-9 → xác nhận hai phép tính tương đương về toán học.</w:t>
+        <w:br/>
+        <w:br/>
+        <w:t>Khớp tuyến tính log-log: DFT ~ O(N^1.88) (rất gần lý thuyết O(N²)), FFT ~ O(N^0.01) (gần O(1) trong dải N kiểm tra; lý thuyết O(N·logN) chỉ rõ khi N rất lớn vì overhead Python lấn át).</w:t>
+        <w:br/>
+        <w:br/>
+        <w:t>Trả lời câu hỏi phụ — Vì sao FFT nhanh hơn DFT khi N lớn?</w:t>
+        <w:br/>
+        <w:t>FFT Cooley–Tukey khai thác tính đối xứng và tuần hoàn của hàm mũ e^(−j·2π/N) để chia bài toán N điểm thành 2 bài toán N/2 điểm, đệ quy cho đến khi còn 1 điểm. Tổng số phép nhân phức giảm từ N² xuống N·log₂(N). Với N = 10000: DFT cần khoảng 10⁸ phép nhân, FFT chỉ ~1.3×10⁵ phép — nhanh hơn ~760 lần lý thuyết, kết quả thực nghiệm tại N = 8000 (~11900×) còn lớn hơn do thêm yếu tố overhead vòng lặp Python.</w:t>
       </w:r>
     </w:p>
     <w:p>
@@ -1016,7 +1044,7 @@
         <w:rPr>
           <w:sz w:val="22"/>
         </w:rPr>
-        <w:t>Khong gap kho khan dang ke. Cac van de nho ve chuan hoa bien do (nhan 2 bin khong phai DC/Nyquist) va viec phai mirror bo loc Gauss qua tan so fs−f0 de giu tin hieu thuc da duoc giai quyet theo huong dan ly thuyet.</w:t>
+        <w:t>Không gặp khó khăn lớn. Một số chi tiết kỹ thuật cần chú ý đã được giải quyết theo lý thuyết: chuẩn hoá biên độ DFT (nhân 2 với bin không phải DC/Nyquist), thêm thành phần mirror tại (fs − f0) cho bộ lọc Gauss để đảm bảo tín hiệu sau lọc là số thực, và cài đặt pha của chirp tuyến tính bằng tích phân tần số tức thời.</w:t>
       </w:r>
     </w:p>
     <w:p>
@@ -1048,7 +1076,7 @@
         <w:rPr>
           <w:sz w:val="22"/>
         </w:rPr>
-        <w:t>Mo phong tin hieu sin 35 Hz lay mau 'analog' o fa=5000 Hz roi subsample voi fs moi = [40, 60, 100, 500] Hz. Xac dinh truong hop nao vi pham Nyquist (fs ≤ 2·fmax) va tinh tan so alias bang cong thuc gap pho.</w:t>
+        <w:t>Mô phỏng tín hiệu sin 35 Hz lấy mẫu 'analog' ở fa = 5000 Hz rồi subsample với fs mới = [40, 60, 100, 500] Hz. Xác định trường hợp nào vi phạm Nyquist (fs ≤ 2·fmax) và tính tần số alias bằng công thức gập phổ falias = |f − k·fs| với k chọn sao cho falias thuộc [0, fs/2].</w:t>
       </w:r>
     </w:p>
     <w:p>
@@ -1064,15 +1092,15 @@
         <w:rPr>
           <w:sz w:val="22"/>
         </w:rPr>
-        <w:t>Buoc 1: Sinh 'analog' tin hieu sin 35 Hz o fa=5000 Hz trong 1 s.</w:t>
-        <w:br/>
-        <w:t>Buoc 2: Voi moi fs_moi: tinh step = fa/fs_moi (lam tron), lay mau d_sub = d[::step].</w:t>
-        <w:br/>
-        <w:t>Buoc 3: Tinh fal = min{|f_signal − k·fs| : k ∈ Z, ket qua ∈ [0, fs/2]}. Day la tan so duy nhat trong vung Nyquist cua fs_moi ma dinh DFT cua tin hieu lay mau se xuat hien.</w:t>
-        <w:br/>
-        <w:t>Buoc 4: Tinh FFT tin hieu subsampled, ve cot pho dang stem.</w:t>
-        <w:br/>
-        <w:t>Buoc 5: Voi fs ≤ 2·f_signal (=70 Hz): aliasing xay ra. Cu the fs=40 → alias=5 Hz, fs=60 → alias=25 Hz. fs=100 va 500 khong aliasing.</w:t>
+        <w:t>Bước 1: Sinh tín hiệu 'analog' sin 35 Hz ở fa = 5000 Hz trong 1 giây.</w:t>
+        <w:br/>
+        <w:t>Bước 2: Với mỗi fs mới: tính step = fa / fs (làm tròn), lấy mẫu d_sub = d[::step].</w:t>
+        <w:br/>
+        <w:t>Bước 3: Tính falias = min{|f_signal − k·fs| : k ∈ ℤ, kết quả thuộc [0, fs/2]}. Đây là tần số duy nhất trong vùng Nyquist của fs mới mà đỉnh DFT của tín hiệu lấy mẫu sẽ xuất hiện.</w:t>
+        <w:br/>
+        <w:t>Bước 4: Tính FFT tín hiệu sau subsample, vẽ cột phổ dạng stem.</w:t>
+        <w:br/>
+        <w:t>Bước 5: Phân loại — với fs ≤ 2·f_signal (≤ 70 Hz) thì aliasing xảy ra. Cụ thể: fs = 40 → alias = 5 Hz, fs = 60 → alias = 25 Hz. fs = 100 và fs = 500 đảm bảo Nyquist nên không aliasing.</w:t>
       </w:r>
     </w:p>
     <w:p>
@@ -1113,11 +1141,13 @@
           <w:rFonts w:ascii="Consolas" w:hAnsi="Consolas"/>
           <w:sz w:val="16"/>
         </w:rPr>
-        <w:t># CAU 3: Dinh ly Nyquist &amp; aliasing</w:t>
+        <w:t># CÂU 3: Định lý Nyquist và aliasing</w:t>
         <w:br/>
         <w:t>import numpy as np, matplotlib.pyplot as plt, scipy.fftpack as sfft</w:t>
         <w:br/>
         <w:br/>
+        <w:t># Mô phỏng tín hiệu "analog" sin 35 Hz bằng fs cao</w:t>
+        <w:br/>
         <w:t>f_analog = 5000</w:t>
         <w:br/>
         <w:t>t = np.arange(0, 1, 1/f_analog)</w:t>
@@ -1126,6 +1156,9 @@
         <w:br/>
         <w:t>d = np.sin(2*np.pi*f_signal*t)</w:t>
         <w:br/>
+        <w:br/>
+        <w:t># Subsample với 4 tần số mẫu mới</w:t>
+        <w:br/>
         <w:t>fs_list = [40, 60, 100, 500]</w:t>
         <w:br/>
         <w:br/>
@@ -1137,7 +1170,7 @@
         <w:br/>
         <w:t xml:space="preserve">    d_sub = d[::step]; t_sub = t[::step]; N_sub = len(d_sub)</w:t>
         <w:br/>
-        <w:t xml:space="preserve">    # Tinh tan so alias</w:t>
+        <w:t xml:space="preserve">    # Tính tần số alias: f_alias = min{|f - k·fs|} sao cho thuộc [0, fs/2]</w:t>
         <w:br/>
         <w:t xml:space="preserve">    cands = [abs(f_signal - k*fs) for k in range(-3, 4)]</w:t>
         <w:br/>
@@ -1145,17 +1178,21 @@
         <w:br/>
         <w:t xml:space="preserve">    nyq = fs/2</w:t>
         <w:br/>
-        <w:t xml:space="preserve">    status = 'DU' if nyq &gt; f_signal else f'THIEU, alias={f_alias:.1f} Hz'</w:t>
-        <w:br/>
+        <w:t xml:space="preserve">    status = 'ĐỦ (không alias)' if nyq &gt; f_signal else f'THIẾU, alias = {f_alias:.1f} Hz'</w:t>
+        <w:br/>
+        <w:br/>
+        <w:t xml:space="preserve">    # Panel trái: tín hiệu analog mờ nền + các mẫu rời rạc chấm đỏ</w:t>
         <w:br/>
         <w:t xml:space="preserve">    axes[i,0].plot(t, d, 'k-', alpha=0.3, label='Analog 35 Hz')</w:t>
         <w:br/>
-        <w:t xml:space="preserve">    axes[i,0].plot(t_sub, d_sub, 'ro-', markersize=4, label=f'fs={fs} Hz')</w:t>
+        <w:t xml:space="preserve">    axes[i,0].plot(t_sub, d_sub, 'ro-', markersize=4, label=f'fs = {fs} Hz')</w:t>
         <w:br/>
         <w:t xml:space="preserve">    axes[i,0].set_xlim([0, 0.3]); axes[i,0].legend(fontsize=8)</w:t>
         <w:br/>
-        <w:t xml:space="preserve">    axes[i,0].set_title(f'fs={fs} Hz, Nyquist={nyq} Hz — {status}')</w:t>
-        <w:br/>
+        <w:t xml:space="preserve">    axes[i,0].set_title(f'fs = {fs} Hz, Nyquist = {nyq} Hz — {status}')</w:t>
+        <w:br/>
+        <w:br/>
+        <w:t xml:space="preserve">    # Panel phải: phổ FFT của tín hiệu đã subsample</w:t>
         <w:br/>
         <w:t xml:space="preserve">    X = np.abs(sfft.fft(d_sub))/N_sub</w:t>
         <w:br/>
@@ -1163,7 +1200,7 @@
         <w:br/>
         <w:t xml:space="preserve">    axes[i,1].stem(hz, 2*X[:len(hz)], basefmt=' ')</w:t>
         <w:br/>
-        <w:t xml:space="preserve">    axes[i,1].set_xlim([0, fs/2]); axes[i,1].set_title(f'Pho fs={fs} Hz')</w:t>
+        <w:t xml:space="preserve">    axes[i,1].set_xlim([0, fs/2]); axes[i,1].set_title(f'Phổ FFT, fs = {fs} Hz')</w:t>
         <w:br/>
         <w:br/>
         <w:t>plt.tight_layout(); plt.savefig('cau3_aliasing.png', dpi=150); plt.show()</w:t>
@@ -1194,7 +1231,7 @@
         <w:br/>
         <w:drawing>
           <wp:inline xmlns:a="http://schemas.openxmlformats.org/drawingml/2006/main" xmlns:pic="http://schemas.openxmlformats.org/drawingml/2006/picture">
-            <wp:extent cx="5486400" cy="4201323"/>
+            <wp:extent cx="5486400" cy="4220308"/>
             <wp:docPr id="3" name="Picture 3"/>
             <wp:cNvGraphicFramePr>
               <a:graphicFrameLocks noChangeAspect="1"/>
@@ -1215,7 +1252,7 @@
                   <pic:spPr>
                     <a:xfrm>
                       <a:off x="0" y="0"/>
-                      <a:ext cx="5486400" cy="4201323"/>
+                      <a:ext cx="5486400" cy="4220308"/>
                     </a:xfrm>
                     <a:prstGeom prst="rect"/>
                   </pic:spPr>
@@ -1276,20 +1313,20 @@
         <w:rPr>
           <w:sz w:val="22"/>
         </w:rPr>
-        <w:t>Ket qua:</w:t>
-        <w:br/>
-        <w:t xml:space="preserve">  fs=40 Hz:  Nyquist=20 Hz &lt; 35 Hz → ALIASING, alias = |35 − 1·40| = 5 Hz (xuat hien dinh tai 5 Hz tren pho).</w:t>
-        <w:br/>
-        <w:t xml:space="preserve">  fs=60 Hz:  Nyquist=30 Hz &lt; 35 Hz → ALIASING, alias = |35 − 1·60| = 25 Hz.</w:t>
-        <w:br/>
-        <w:t xml:space="preserve">  fs=100 Hz: Nyquist=50 Hz &gt; 35 Hz → KHONG aliasing, dinh dung 35 Hz.</w:t>
-        <w:br/>
-        <w:t xml:space="preserve">  fs=500 Hz: Nyquist=250 Hz &gt; 35 Hz → KHONG aliasing, dinh 35 Hz, do trung thuc cao.</w:t>
-        <w:br/>
-        <w:br/>
-        <w:t>Tra loi cau hoi phu: Vi sao ADC can bo loc anti-aliasing truoc khi lay mau?</w:t>
-        <w:br/>
-        <w:t>Tin hieu thuc te luon co thanh phan tan so cao (nhieu, harmonic). Neu cac thanh phan &gt; fs/2, chung se bi gap (fold) vao dai hop le [0, fs/2] va KHONG the tach khoi tin hieu that sau khi lay mau — aliasing la qua trinh khong dao nguoc duoc. Bo loc anti-aliasing la bo loc thong thap analog dat truoc mach ADC, cat cac thanh phan &gt; fs/2 truoc khi xay ra lay mau.</w:t>
+        <w:t>Kết quả phân loại 4 trường hợp:</w:t>
+        <w:br/>
+        <w:t xml:space="preserve">  fs = 40 Hz:  Nyquist = 20 Hz &lt; 35 Hz → ALIASING, alias = |35 − 1·40| = 5 Hz (đỉnh phổ thật xuất hiện tại 5 Hz).</w:t>
+        <w:br/>
+        <w:t xml:space="preserve">  fs = 60 Hz:  Nyquist = 30 Hz &lt; 35 Hz → ALIASING, alias = |35 − 1·60| = 25 Hz.</w:t>
+        <w:br/>
+        <w:t xml:space="preserve">  fs = 100 Hz: Nyquist = 50 Hz &gt; 35 Hz → KHÔNG aliasing, đỉnh phổ đúng 35 Hz.</w:t>
+        <w:br/>
+        <w:t xml:space="preserve">  fs = 500 Hz: Nyquist = 250 Hz &gt; 35 Hz → KHÔNG aliasing, đỉnh 35 Hz, độ trung thực cao.</w:t>
+        <w:br/>
+        <w:br/>
+        <w:t>Trả lời câu hỏi phụ — Vì sao ADC cần bộ lọc anti-aliasing trước khi lấy mẫu?</w:t>
+        <w:br/>
+        <w:t>Tín hiệu thực tế luôn chứa thành phần tần số cao không mong muốn (nhiễu băng rộng, harmonic của các nguồn nhiễu công nghiệp, EMI…). Nếu các thành phần này có tần số &gt; fs/2, chúng sẽ bị gập (fold) vào dải hợp lệ [0, fs/2] sau khi lấy mẫu và KHÔNG thể tách khỏi tín hiệu thật về sau — aliasing là quá trình mất thông tin không thể đảo ngược được. Bộ lọc anti-aliasing là bộ lọc thông thấp analog đặt ngay trước mạch ADC, có tác dụng cắt mọi thành phần tần số &gt; fs/2 trước khi xảy ra quá trình lấy mẫu, đảm bảo tín hiệu sau ADC chỉ còn thành phần hợp lệ.</w:t>
       </w:r>
     </w:p>
     <w:p>
@@ -1305,7 +1342,7 @@
         <w:rPr>
           <w:sz w:val="22"/>
         </w:rPr>
-        <w:t>Khong gap kho khan dang ke. Cac van de nho ve chuan hoa bien do (nhan 2 bin khong phai DC/Nyquist) va viec phai mirror bo loc Gauss qua tan so fs−f0 de giu tin hieu thuc da duoc giai quyet theo huong dan ly thuyet.</w:t>
+        <w:t>Không gặp khó khăn lớn. Một số chi tiết kỹ thuật cần chú ý đã được giải quyết theo lý thuyết: chuẩn hoá biên độ DFT (nhân 2 với bin không phải DC/Nyquist), thêm thành phần mirror tại (fs − f0) cho bộ lọc Gauss để đảm bảo tín hiệu sau lọc là số thực, và cài đặt pha của chirp tuyến tính bằng tích phân tần số tức thời.</w:t>
       </w:r>
     </w:p>
     <w:p>
@@ -1337,7 +1374,7 @@
         <w:rPr>
           <w:sz w:val="22"/>
         </w:rPr>
-        <w:t>Tin hieu nhieu gom 3 sin (6, 14, 40 Hz) + nhieu Gauss, fs=500 Hz, T=4 s. Thiet ke bo loc thong dai dang ham Gauss trong mien tan so (tam 14 Hz, σ=2 Hz), nhan voi pho roi IFFT ve mien thoi gian. Tinh SNR truoc va sau loc de danh gia hieu qua.</w:t>
+        <w:t>Tín hiệu nhiễu gồm 3 sin (6, 14, 40 Hz) cộng nhiễu Gauss với fs = 500 Hz, T = 4 s. Thiết kế bộ lọc thông dải dạng hàm Gauss trong miền tần số (tâm 14 Hz, σ = 2 Hz), nhân với phổ tín hiệu rồi IFFT về miền thời gian. Tính SNR trước và sau lọc (so với thành phần 14 Hz lý tưởng) để đánh giá hiệu quả lọc.</w:t>
       </w:r>
     </w:p>
     <w:p>
@@ -1353,15 +1390,15 @@
         <w:rPr>
           <w:sz w:val="22"/>
         </w:rPr>
-        <w:t>Buoc 1: Sinh tin hieu = sin(2π·6t) + 0.8·sin(2π·14t) + 1.2·sin(2π·40t) + 0.5·randn (seed=2026), fs=500, T=4 s.</w:t>
-        <w:br/>
-        <w:t>Buoc 2: Tinh SNR_truoc = 10·log10(var(ref)/var(signal − ref)) voi ref = 0.8·sin(2π·14t).</w:t>
-        <w:br/>
-        <w:t>Buoc 3: FFT tin hieu, tao bo loc Gauss H(f) = exp(−(f−14)²/(2·σ²)) + exp(−(f−(fs−14))²/(2·σ²)). Phan mirror (fs−f0) la de giu tin hieu sau loc la so thuc (X.H phai co tinh doi xung Hermitian).</w:t>
-        <w:br/>
-        <w:t>Buoc 4: Y(f) = X(f)·H(f), y(t) = Real(IFFT(Y)).</w:t>
-        <w:br/>
-        <w:t>Buoc 5: Tinh SNR_sau va cai thien. Ket qua: ~30 dB cai thien.</w:t>
+        <w:t>Bước 1: Sinh tín hiệu = sin(2π·6t) + 0.8·sin(2π·14t) + 1.2·sin(2π·40t) + 0.5·randn (seed = 2026), fs = 500, T = 4 s.</w:t>
+        <w:br/>
+        <w:t>Bước 2: Tính SNR_trước = 10·log10(var(ref)/var(signal − ref)) với ref = 0.8·sin(2π·14t).</w:t>
+        <w:br/>
+        <w:t>Bước 3: FFT tín hiệu, tạo bộ lọc Gauss H(f) = exp(−(f − 14)² / (2·σ²)) + exp(−(f − (fs − 14))² / (2·σ²)). Phần mirror tại (fs − f0) là bắt buộc để bộ lọc đối xứng Hermitian, đảm bảo tín hiệu sau lọc khi IFFT là số thực.</w:t>
+        <w:br/>
+        <w:t>Bước 4: Áp định lý tích chập: Y(f) = X(f)·H(f), y(t) = Real(IFFT(Y)).</w:t>
+        <w:br/>
+        <w:t>Bước 5: Tính SNR_sau và mức cải thiện. Kết quả thực nghiệm: cải thiện khoảng 30 dB, tín hiệu sau lọc gần như chỉ còn thành phần 14 Hz thuần tuý.</w:t>
       </w:r>
     </w:p>
     <w:p>
@@ -1402,11 +1439,13 @@
           <w:rFonts w:ascii="Consolas" w:hAnsi="Consolas"/>
           <w:sz w:val="16"/>
         </w:rPr>
-        <w:t># CAU 4: Loc Gauss bandpass giu 14 Hz</w:t>
+        <w:t># CÂU 4: Lọc Gauss bandpass giữ thành phần 14 Hz</w:t>
         <w:br/>
         <w:t>import numpy as np, scipy.fftpack as sfft, matplotlib.pyplot as plt</w:t>
         <w:br/>
         <w:br/>
+        <w:t># Tín hiệu nhiễu: 3 sin + nhiễu Gauss</w:t>
+        <w:br/>
         <w:t>fs, T = 500, 4</w:t>
         <w:br/>
         <w:t>t = np.arange(0, T, 1/fs); N = len(t)</w:t>
@@ -1420,13 +1459,19 @@
         <w:t xml:space="preserve">          + 1.2*np.sin(2*np.pi*40*t) + 0.5*np.random.randn(N))</w:t>
         <w:br/>
         <w:br/>
-        <w:t>def snr(s, ref): return 10*np.log10(np.var(ref)/np.var(s-ref))</w:t>
+        <w:t>def snr(s, ref):</w:t>
+        <w:br/>
+        <w:t xml:space="preserve">    """SNR tính theo biên độ tham chiếu (14 Hz lý tưởng)."""</w:t>
+        <w:br/>
+        <w:t xml:space="preserve">    return 10*np.log10(np.var(ref)/np.var(s-ref))</w:t>
         <w:br/>
         <w:br/>
         <w:t>snr_truoc = snr(signal, 0.8*sig_clean)</w:t>
         <w:br/>
         <w:br/>
-        <w:t># Bo loc Gauss thong dai tam f0=14 Hz, sigma=2 Hz (co them mirror f s -f0)</w:t>
+        <w:t># Bộ lọc Gauss thông dải tâm f0 = 14 Hz, sigma = 2 Hz</w:t>
+        <w:br/>
+        <w:t># Phải có thêm thành phần mirror tại (fs - f0) để tín hiệu sau lọc là số thực</w:t>
         <w:br/>
         <w:t>hz_full = np.linspace(0, fs, N)</w:t>
         <w:br/>
@@ -1436,11 +1481,16 @@
         <w:br/>
         <w:t xml:space="preserve">   + np.exp(-((hz_full-(fs-f0))/sigma)**2))</w:t>
         <w:br/>
+        <w:br/>
+        <w:t># Định lý tích chập: Y(f) = X(f)·H(f), y(t) = IFFT(Y)</w:t>
+        <w:br/>
         <w:t>y = np.real(sfft.ifft(sfft.fft(signal)*H))</w:t>
         <w:br/>
         <w:t>snr_sau = snr(y, 0.8*sig_clean)</w:t>
         <w:br/>
-        <w:t>print(f'SNR truoc={snr_truoc:.2f} dB, sau={snr_sau:.2f} dB, cai thien={snr_sau-snr_truoc:.2f} dB')</w:t>
+        <w:t>print(f'SNR trước lọc = {snr_truoc:.2f} dB, sau lọc = {snr_sau:.2f} dB')</w:t>
+        <w:br/>
+        <w:t>print(f'Cải thiện SNR = {snr_sau - snr_truoc:.2f} dB')</w:t>
         <w:br/>
         <w:br/>
         <w:t>X = sfft.fft(signal)/N</w:t>
@@ -1449,23 +1499,31 @@
         <w:br/>
         <w:t>fig, ax = plt.subplots(3, 1, figsize=(11, 9))</w:t>
         <w:br/>
-        <w:t>ax[0].plot(t, signal, alpha=0.7, label='Goc')</w:t>
-        <w:br/>
-        <w:t>ax[0].plot(t, y, 'r', label='Sau loc')</w:t>
-        <w:br/>
-        <w:t>ax[0].set_xlim([0, 1]); ax[0].legend()</w:t>
+        <w:t>ax[0].plot(t, signal, alpha=0.7, label='Tín hiệu gốc')</w:t>
+        <w:br/>
+        <w:t>ax[0].plot(t, y, 'r', label='Sau lọc')</w:t>
+        <w:br/>
+        <w:t>ax[0].set_xlim([0, 1]); ax[0].legend(); ax[0].set_xlabel('Thời gian (s)')</w:t>
+        <w:br/>
+        <w:t>ax[0].set_title(f'Miền thời gian — SNR {snr_truoc:.1f} dB → {snr_sau:.1f} dB')</w:t>
+        <w:br/>
         <w:br/>
         <w:t>ax[1].plot(hz_half, 2*np.abs(X[:len(hz_half)])); ax[1].set_xlim([0, 60])</w:t>
         <w:br/>
-        <w:t>ax[1].set_title('Pho goc')</w:t>
+        <w:t>ax[1].set_xlabel('Tần số (Hz)'); ax[1].set_title('Phổ tín hiệu gốc')</w:t>
+        <w:br/>
         <w:br/>
         <w:t>Y_disp = sfft.fft(signal)*H/N</w:t>
         <w:br/>
-        <w:t>ax[2].plot(hz_half, 2*np.abs(Y_disp[:len(hz_half)]), 'r', label='Sau loc')</w:t>
-        <w:br/>
-        <w:t>ax[2].plot(hz_half, H[:len(hz_half)]*np.max(2*np.abs(X[:len(hz_half)])), 'g--', label='Gauss')</w:t>
-        <w:br/>
-        <w:t>ax[2].set_xlim([0, 60]); ax[2].legend()</w:t>
+        <w:t>ax[2].plot(hz_half, 2*np.abs(Y_disp[:len(hz_half)]), 'r', label='Phổ sau lọc')</w:t>
+        <w:br/>
+        <w:t>ax[2].plot(hz_half, H[:len(hz_half)]*np.max(2*np.abs(X[:len(hz_half)])),</w:t>
+        <w:br/>
+        <w:t xml:space="preserve">           'g--', label='Bộ lọc Gauss')</w:t>
+        <w:br/>
+        <w:t>ax[2].set_xlim([0, 60]); ax[2].set_xlabel('Tần số (Hz)')</w:t>
+        <w:br/>
+        <w:t>ax[2].set_title('Phổ sau lọc kèm đường cong bộ lọc'); ax[2].legend()</w:t>
         <w:br/>
         <w:t>plt.tight_layout(); plt.savefig('cau4_loc.png', dpi=150); plt.show()</w:t>
         <w:br/>
@@ -1495,7 +1553,7 @@
         <w:br/>
         <w:drawing>
           <wp:inline xmlns:a="http://schemas.openxmlformats.org/drawingml/2006/main" xmlns:pic="http://schemas.openxmlformats.org/drawingml/2006/picture">
-            <wp:extent cx="5486400" cy="4466299"/>
+            <wp:extent cx="5486400" cy="4488873"/>
             <wp:docPr id="4" name="Picture 4"/>
             <wp:cNvGraphicFramePr>
               <a:graphicFrameLocks noChangeAspect="1"/>
@@ -1516,7 +1574,7 @@
                   <pic:spPr>
                     <a:xfrm>
                       <a:off x="0" y="0"/>
-                      <a:ext cx="5486400" cy="4466299"/>
+                      <a:ext cx="5486400" cy="4488873"/>
                     </a:xfrm>
                     <a:prstGeom prst="rect"/>
                   </pic:spPr>
@@ -1577,12 +1635,12 @@
         <w:rPr>
           <w:sz w:val="22"/>
         </w:rPr>
-        <w:t>Ket qua: SNR truoc = -6.60 dB, SNR sau = 23.51 dB, cai thien 30.12 dB. Sau khi loc, tin hieu thoi gian tro thanh xap xi 0.8·sin(2π·14t) thuan tuy, cac thanh phan 6 Hz, 40 Hz va nhieu deu bi triet tieu.</w:t>
-        <w:br/>
-        <w:br/>
-        <w:t>Tra loi cau hoi phu: Vi sao dung cua so Gauss thay vi cat cung (mat na 0/1)?</w:t>
-        <w:br/>
-        <w:t>Cat cung cac bin cho dap ung xung tuong ung trong mien thoi gian la dang sinc — gay hieu ung Gibbs (gon song/ringing) tai cac diem chuyen tiep. Cua so Gauss co bien tron, nen dap ung xung cung tron va khong co ringing. Day la cung nguyen ly voi cua so Hann/Hamming trong STFT: bien tron giam ro pho (spectral leakage) va artifact thoi gian.</w:t>
+        <w:t>Kết quả: SNR trước lọc = -6.60 dB, SNR sau lọc = 23.51 dB, cải thiện 30.12 dB. Sau lọc, tín hiệu thời gian trở thành xấp xỉ thuần tuý 0.8·sin(2π·14t); các thành phần 6 Hz, 40 Hz và nhiễu Gauss đều bị triệt tiêu đáng kể nhờ bộ lọc Gauss bandpass tâm 14 Hz, σ = 2 Hz.</w:t>
+        <w:br/>
+        <w:br/>
+        <w:t>Trả lời câu hỏi phụ — Vì sao dùng cửa sổ Gauss thay vì cắt cứng (mặt nạ 0/1)?</w:t>
+        <w:br/>
+        <w:t>Cắt cứng các bin (mặt nạ chỉ thị) trong miền tần số cho đáp ứng xung tương ứng trong miền thời gian có dạng sinc — gây hiệu ứng Gibbs với gợn sóng (ringing) tại các điểm chuyển tiếp. Cửa sổ Gauss có biên trơn (mọi đạo hàm liên tục), nên đáp ứng xung cũng trơn và gần như không có ringing. Đây là cùng nguyên lý với các cửa sổ Hann/Hamming/Kaiser dùng trong STFT và thiết kế FIR: biên trơn giúp giảm rò phổ (spectral leakage) và artifact trong miền thời gian.</w:t>
       </w:r>
     </w:p>
     <w:p>
@@ -1598,7 +1656,7 @@
         <w:rPr>
           <w:sz w:val="22"/>
         </w:rPr>
-        <w:t>Khong gap kho khan dang ke. Cac van de nho ve chuan hoa bien do (nhan 2 bin khong phai DC/Nyquist) va viec phai mirror bo loc Gauss qua tan so fs−f0 de giu tin hieu thuc da duoc giai quyet theo huong dan ly thuyet.</w:t>
+        <w:t>Không gặp khó khăn lớn. Một số chi tiết kỹ thuật cần chú ý đã được giải quyết theo lý thuyết: chuẩn hoá biên độ DFT (nhân 2 với bin không phải DC/Nyquist), thêm thành phần mirror tại (fs − f0) cho bộ lọc Gauss để đảm bảo tín hiệu sau lọc là số thực, và cài đặt pha của chirp tuyến tính bằng tích phân tần số tức thời.</w:t>
       </w:r>
     </w:p>
     <w:p>
@@ -1630,7 +1688,7 @@
         <w:rPr>
           <w:sz w:val="22"/>
         </w:rPr>
-        <w:t>Sinh chirp tuyen tinh 5→50 Hz trong 6 s, fs=1000 Hz. Cai STFT bang vong lap voi cua so Hann o ba chieu dai L=64, 256, 1024 (hop=L/4). Ve 3 spectrogram va danh gia su danh doi giua phan giai thoi gian va phan giai tan so theo gioi han Heisenberg.</w:t>
+        <w:t>Sinh chirp tuyến tính 5 → 50 Hz trong 6 s, fs = 1000 Hz. Cài STFT bằng vòng lặp với cửa sổ Hann ở ba chiều dài L = 64, 256, 1024 (cấu hình chính theo đề: L = 256, hop = 32). Vẽ 3 spectrogram và đánh giá sự đánh đổi giữa phân giải thời gian và phân giải tần số theo nguyên lý bất định Heisenberg.</w:t>
       </w:r>
     </w:p>
     <w:p>
@@ -1646,15 +1704,17 @@
         <w:rPr>
           <w:sz w:val="22"/>
         </w:rPr>
-        <w:t>Buoc 1: Tao chirp tuyen tinh voi pha phi(t) = 2π·(f0·t + (f1−f0)/(2T)·t²) de tan so tuc thoi tang tuyen tinh tu 5 den 50 Hz trong 6 s.</w:t>
-        <w:br/>
-        <w:t>Buoc 2: Cai stft_loop(x, L, hop): cua so Hann, vong lap m=0..M-1, lay segment [m·hop, m·hop+L], nhan voi cua so roi FFT.</w:t>
-        <w:br/>
-        <w:t>Buoc 3: Voi moi L ∈ {64, 256, 1024}, hop=L/4: chay STFT, ve pcolormesh voi truc thoi gian la (m·hop + L/2)/fs.</w:t>
-        <w:br/>
-        <w:t>Buoc 4: Phu duong tan so tuc thoi that (mau trang dut net) de so sanh.</w:t>
-        <w:br/>
-        <w:t>Buoc 5: Quan sat danh doi: L=64 cho phan giai thoi gian tot (Δt=64 ms) nhung pho 'beo' (Δf=15.6 Hz); L=1024 nguoc lai (Δt=1024 ms, Δf=0.98 Hz); L=256 can bang.</w:t>
+        <w:t>Bước 1: Tạo chirp tuyến tính với pha φ(t) = 2π·(f0·t + (f1 − f0)/(2T)·t²). Đạo hàm pha cho tần số tức thời tăng tuyến tính từ 5 đến 50 Hz trong 6 giây.</w:t>
+        <w:br/>
+        <w:t>Bước 2: Cài stft_loop(x, L, hop): cửa sổ Hann w[n] = 0.5(1 − cos(2πn/(L−1))), vòng lặp m = 0..M−1, lấy segment x[m·hop : m·hop + L], nhân với cửa sổ rồi FFT.</w:t>
+        <w:br/>
+        <w:t>Bước 3: Theo đề, cấu hình chính là L = 256, hop (Δ) = 32. Để so sánh ảnh hưởng của riêng kích thước cửa sổ một cách công bằng, ta giữ hop = 32 cho cả ba trường hợp L ∈ {64, 256, 1024}.</w:t>
+        <w:br/>
+        <w:t>Bước 4: Vẽ spectrogram bằng pcolormesh; trục thời gian là (m·hop + L/2)/fs (đặt giữa cửa sổ).</w:t>
+        <w:br/>
+        <w:t>Bước 5: Phủ đường tần số tức thời thật (trắng đứt nét) để dễ so sánh với tổng hợp STFT.</w:t>
+        <w:br/>
+        <w:t>Bước 6: Quan sát đánh đổi Heisenberg — Δt·Δf không thể cùng nhỏ, L tăng làm Δf nhỏ nhưng Δt lớn.</w:t>
       </w:r>
     </w:p>
     <w:p>
@@ -1695,7 +1755,7 @@
           <w:rFonts w:ascii="Consolas" w:hAnsi="Consolas"/>
           <w:sz w:val="16"/>
         </w:rPr>
-        <w:t># CAU 5: STFT cho chirp 5-&gt;50 Hz, L=256 hop=32 (theo de)</w:t>
+        <w:t># CÂU 5: STFT cho chirp 5 → 50 Hz, cấu hình chính L=256, hop=32</w:t>
         <w:br/>
         <w:t>import numpy as np, scipy.fftpack as sfft, matplotlib.pyplot as plt</w:t>
         <w:br/>
@@ -1706,18 +1766,20 @@
         <w:br/>
         <w:t>f0, f1 = 5, 50</w:t>
         <w:br/>
-        <w:t># Pha cua chirp tuyen tinh = tich phan tan so tuc thoi</w:t>
+        <w:t># Pha của chirp tuyến tính = tích phân tần số tức thời</w:t>
         <w:br/>
         <w:t>phase = 2*np.pi*(f0*t + (f1-f0)/(2*T)*t**2)</w:t>
         <w:br/>
         <w:t>signal = np.sin(phase)</w:t>
         <w:br/>
-        <w:t>inst_freq = f0 + (f1-f0)/T * t</w:t>
+        <w:t>inst_freq = f0 + (f1-f0)/T * t   # tần số tức thời để so sánh</w:t>
         <w:br/>
         <w:br/>
         <w:t>def stft_loop(x, L, hop):</w:t>
         <w:br/>
-        <w:t xml:space="preserve">    win = 0.5*(1 - np.cos(2*np.pi*np.arange(L)/(L-1)))   # Hann</w:t>
+        <w:t xml:space="preserve">    """STFT cài đặt bằng vòng lặp với cửa sổ Hann."""</w:t>
+        <w:br/>
+        <w:t xml:space="preserve">    win = 0.5*(1 - np.cos(2*np.pi*np.arange(L)/(L-1)))</w:t>
         <w:br/>
         <w:t xml:space="preserve">    M = (len(x) - L)//hop + 1</w:t>
         <w:br/>
@@ -1732,9 +1794,9 @@
         <w:t xml:space="preserve">    return S</w:t>
         <w:br/>
         <w:br/>
-        <w:t># Theo de: cau hinh chinh la L=256, hop=32. Giu hop=32 cho ca 3 truong hop</w:t>
-        <w:br/>
-        <w:t># de so sanh anh huong cua L (kich thuoc cua so) cong bang.</w:t>
+        <w:t># Theo yêu cầu đề: L = 256, Δ (hop) = 32. Giữ hop = 32 cho cả 3 trường hợp L</w:t>
+        <w:br/>
+        <w:t># để so sánh ảnh hưởng của riêng kích thước cửa sổ một cách công bằng.</w:t>
         <w:br/>
         <w:t>hop = 32</w:t>
         <w:br/>
@@ -1750,11 +1812,13 @@
         <w:br/>
         <w:t xml:space="preserve">    pcm = axes[i].pcolormesh(tA, hz, 2*np.abs(S[:L//2+1]), shading='auto', cmap='viridis')</w:t>
         <w:br/>
-        <w:t xml:space="preserve">    axes[i].plot(t, inst_freq, 'w--', alpha=0.7, label='Tan so that')</w:t>
+        <w:t xml:space="preserve">    axes[i].plot(t, inst_freq, 'w--', alpha=0.7, label='Tần số thật')</w:t>
         <w:br/>
         <w:t xml:space="preserve">    axes[i].set_ylim([0, 60]); axes[i].legend()</w:t>
         <w:br/>
-        <w:t xml:space="preserve">    axes[i].set_title(f'L={L}, hop={hop}, Δt={L/fs*1000:.0f} ms, Δf={fs/L:.1f} Hz')</w:t>
+        <w:t xml:space="preserve">    axes[i].set_xlabel('Thời gian (s)'); axes[i].set_ylabel('Tần số (Hz)')</w:t>
+        <w:br/>
+        <w:t xml:space="preserve">    axes[i].set_title(f'L = {L}, hop = {hop}, Δt = {L/fs*1000:.0f} ms, Δf = {fs/L:.1f} Hz')</w:t>
         <w:br/>
         <w:t xml:space="preserve">    plt.colorbar(pcm, ax=axes[i])</w:t>
         <w:br/>
@@ -1786,7 +1850,7 @@
         <w:br/>
         <w:drawing>
           <wp:inline xmlns:a="http://schemas.openxmlformats.org/drawingml/2006/main" xmlns:pic="http://schemas.openxmlformats.org/drawingml/2006/picture">
-            <wp:extent cx="5486400" cy="6018057"/>
+            <wp:extent cx="5486400" cy="5486400"/>
             <wp:docPr id="5" name="Picture 5"/>
             <wp:cNvGraphicFramePr>
               <a:graphicFrameLocks noChangeAspect="1"/>
@@ -1807,7 +1871,7 @@
                   <pic:spPr>
                     <a:xfrm>
                       <a:off x="0" y="0"/>
-                      <a:ext cx="5486400" cy="6018057"/>
+                      <a:ext cx="5486400" cy="5486400"/>
                     </a:xfrm>
                     <a:prstGeom prst="rect"/>
                   </pic:spPr>
@@ -1868,22 +1932,19 @@
         <w:rPr>
           <w:sz w:val="22"/>
         </w:rPr>
-        <w:t>Cau hinh theo de: L=256, Δ=hop=32. Giu hop=32 cho ca 3 truong hop L de so sanh cong bang anh huong cua kich thuoc cua so.</w:t>
-        <w:br/>
-        <w:br/>
-        <w:t>Ket qua 3 cau hinh:</w:t>
-        <w:br/>
-        <w:t xml:space="preserve">  L=64,   hop=32: Δt=64 ms,  Δf=15.62 Hz  — duong chirp ro net theo thoi gian, dam dac (mo) theo tan so.</w:t>
-        <w:br/>
-        <w:t xml:space="preserve">  L=256,  hop=32: Δt=256 ms, Δf=3.91 Hz   — can bang tot, duong chirp mong va lien tuc.</w:t>
-        <w:br/>
-        <w:t xml:space="preserve">  L=1024, hop=32: Δt=1024 ms, Δf=0.98 Hz  — duong chirp sac net theo tan so nhung mo theo thoi gian.</w:t>
-        <w:br/>
-        <w:br/>
-        <w:t>Quan sat danh doi Heisenberg: Δt·Δf ≥ const → khong the dat phan giai cao ca o thoi gian va tan so cung luc. Khi L tang, cua so phu nhieu chu ky cua tin hieu hon → tan so xac dinh ro hon (Δf nho) nhung 'lam mo' tap trung thoi gian (Δt lon). Đây là dạng cụ thể của nguyên lý bất định trong xử lý tín hiệu.</w:t>
-        <w:br/>
-        <w:br/>
-        <w:t>Tra loi cau hoi phu: Ung dung phan giai thoi gian cao (L nho): phat hien spike EEG (&lt;100 ms), xung soc trong vibration/seismic, onset/offset am tiet trong nhan dang loi noi, transient trong chan dong co khi. Ung dung phan giai tan so cao (L lon): phan biet hai sin gan nhau (dinh danh not nhac, harmonic dong co), do damping ratio (can FWHM dinh cong huong chinh xac), phan tich tin hieu on dinh lau dai (steady-state) nhu vibration may quay.</w:t>
+        <w:t>Kết quả ba cấu hình (cùng hop = 32):</w:t>
+        <w:br/>
+        <w:t xml:space="preserve">  L = 64,   hop = 32: Δt = 64 ms,   Δf = 15.62 Hz  — đường chirp rõ nét theo thời gian, đậm đặc (nhoè) theo trục tần số.</w:t>
+        <w:br/>
+        <w:t xml:space="preserve">  L = 256,  hop = 32: Δt = 256 ms,  Δf = 3.91 Hz   — cân bằng tốt, đường chirp mảnh và liên tục.</w:t>
+        <w:br/>
+        <w:t xml:space="preserve">  L = 1024, hop = 32: Δt = 1024 ms, Δf = 0.98 Hz   — đường chirp sắc nét theo tần số nhưng "mờ" theo thời gian (rộng theo phương ngang).</w:t>
+        <w:br/>
+        <w:br/>
+        <w:t>Quan sát đánh đổi Heisenberg: Δt·Δf ≥ const → không thể đồng thời đạt phân giải cao cả ở thời gian và tần số. Khi L tăng, cửa sổ chứa nhiều chu kỳ tín hiệu hơn → tần số xác định rõ hơn (Δf nhỏ) nhưng "làm mờ" tập trung thời gian (Δt lớn). Đây là dạng cụ thể của nguyên lý bất định trong xử lý tín hiệu.</w:t>
+        <w:br/>
+        <w:br/>
+        <w:t>Trả lời câu hỏi phụ — Ứng dụng cần phân giải thời gian cao (L nhỏ): phát hiện spike EEG (&lt; 100 ms), xung sốc trong vibration/seismic, onset/offset âm tiết trong nhận dạng lời nói, transient trong chấn động cơ khí. Ứng dụng cần phân giải tần số cao (L lớn): phân biệt hai sin gần nhau (định danh nốt nhạc, harmonic động cơ), đo damping ratio (cần FWHM đỉnh cộng hưởng chính xác), phân tích tín hiệu ổn định lâu dài (steady-state) như vibration máy quay liên tục.</w:t>
       </w:r>
     </w:p>
     <w:p>
@@ -1899,7 +1960,7 @@
         <w:rPr>
           <w:sz w:val="22"/>
         </w:rPr>
-        <w:t>Khong gap kho khan dang ke. Cac van de nho ve chuan hoa bien do (nhan 2 bin khong phai DC/Nyquist) va viec phai mirror bo loc Gauss qua tan so fs−f0 de giu tin hieu thuc da duoc giai quyet theo huong dan ly thuyet.</w:t>
+        <w:t>Không gặp khó khăn lớn. Một số chi tiết kỹ thuật cần chú ý đã được giải quyết theo lý thuyết: chuẩn hoá biên độ DFT (nhân 2 với bin không phải DC/Nyquist), thêm thành phần mirror tại (fs − f0) cho bộ lọc Gauss để đảm bảo tín hiệu sau lọc là số thực, và cài đặt pha của chirp tuyến tính bằng tích phân tần số tức thời.</w:t>
       </w:r>
     </w:p>
     <w:p>
@@ -1931,7 +1992,7 @@
         <w:rPr>
           <w:sz w:val="22"/>
         </w:rPr>
-        <w:t>Tai dataset EEGrestingState.mat, ve 10 giay dau, tinh pho FFT toan cuc va pho Welch (cua so 1s, overlap 50%). Tinh phan tram nang luong tren 5 bang tan sinh ly Delta/Theta/Alpha/Beta/Gamma de xac dinh bang chiem uu the.</w:t>
+        <w:t>Đọc dataset EEGrestingState.mat, vẽ 10 giây đầu của tín hiệu, tính phổ FFT toàn cục và phổ Welch (cửa sổ 1 s, overlap 50 %). Tô màu 5 băng tần sinh lý Delta/Theta/Alpha/Beta/Gamma và tính phần trăm năng lượng từng băng để xác định băng chiếm ưu thế, sau đó diễn giải ý nghĩa sinh lý.</w:t>
       </w:r>
     </w:p>
     <w:p>
@@ -1947,15 +2008,15 @@
         <w:rPr>
           <w:sz w:val="22"/>
         </w:rPr>
-        <w:t>Buoc 1: Doc eegdata va srate tu file .mat bang scipy.io.loadmat. eegdata: (1, 122880), srate=1024 Hz.</w:t>
-        <w:br/>
-        <w:t>Buoc 2: FFT toan cuc va chuan hoa bien do. Tinh truc hz = linspace(0, fs/2, N/2+1).</w:t>
-        <w:br/>
-        <w:t>Buoc 3: Welch voi nperseg=fs (1 s), noverlap=fs/2 (50%). Welch trung binh nhieu cua so → giam phuong sai uoc luong pho, on dinh hon FFT don.</w:t>
-        <w:br/>
-        <w:t>Buoc 4: Tinh nang luong tuong doi (% tong) cho 5 bang tan dua tren ampl². Bang Delta lon nhat do tin hieu EEG nghi co thanh phan tan thap (drift, nhip cham) chiem uu the; band Alpha cung dang chu y (~18%) — dac trung cua trang thai nghi nham mat.</w:t>
-        <w:br/>
-        <w:t>Buoc 5: Ve 3 panel: tin hieu thoi gian 10 s, FFT toan cuc, Welch (log scale).</w:t>
+        <w:t>Bước 1: Đọc eegdata và srate từ file .mat bằng scipy.io.loadmat. Dataset: eegdata shape (1, 122880), srate = 1024 Hz, thời lượng 120 giây.</w:t>
+        <w:br/>
+        <w:t>Bước 2: Tính FFT toàn cục và chuẩn hoá biên độ (chia N, nhân 2 cho các bin không phải DC). Trục tần số hz = linspace(0, fs/2, N/2 + 1).</w:t>
+        <w:br/>
+        <w:t>Bước 3: Phổ Welch với nperseg = fs (1 giây), noverlap = fs/2 (50 %). Welch là trung bình modulus bình phương của FFT trên nhiều cửa sổ chồng lấp → giảm phương sai ước lượng phổ, đường phổ mịn hơn nhiều so với FFT đơn.</w:t>
+        <w:br/>
+        <w:t>Bước 4: Tính năng lượng tương đối (% tổng) cho 5 băng tần dựa trên ampl². Băng Delta lớn nhất (~43 %) do EEG nghỉ raw có nhiều thành phần tần thấp (drift điện cực, dao động chậm ~1−2 Hz); băng Alpha (~18 %) là đỉnh sinh lý đặc trưng của trạng thái nghỉ mắt nhắm.</w:t>
+        <w:br/>
+        <w:t>Bước 5: Vẽ 3 panel: (a) 10 giây đầu của tín hiệu, (b) FFT toàn cục 0–70 Hz tô màu 5 băng, (c) Welch trên thang log để dễ thấy phân bố công suất nhỏ ở tần cao.</w:t>
       </w:r>
     </w:p>
     <w:p>
@@ -1996,13 +2057,15 @@
           <w:rFonts w:ascii="Consolas" w:hAnsi="Consolas"/>
           <w:sz w:val="16"/>
         </w:rPr>
-        <w:t># CAU 6: Phan tich pho EEG</w:t>
+        <w:t># CÂU 6: Phân tích phổ EEG thực tế</w:t>
         <w:br/>
         <w:t>import numpy as np, matplotlib.pyplot as plt, scipy.fftpack as sfft</w:t>
         <w:br/>
         <w:t>import scipy.signal, scipy.io as sio</w:t>
         <w:br/>
         <w:br/>
+        <w:t># Đọc dataset EEGrestingState.mat</w:t>
+        <w:br/>
         <w:t>m = sio.loadmat('EEGrestingState.mat')</w:t>
         <w:br/>
         <w:t>eeg = m['eegdata'].flatten().astype(float)</w:t>
@@ -2011,6 +2074,10 @@
         <w:br/>
         <w:t>N = len(eeg); t = np.arange(N)/fs</w:t>
         <w:br/>
+        <w:t>print(f'Số mẫu: {N}, fs = {fs} Hz, thời lượng = {N/fs:.1f} s')</w:t>
+        <w:br/>
+        <w:br/>
+        <w:t># FFT toàn cục và chuẩn hoá biên độ</w:t>
         <w:br/>
         <w:t>X = sfft.fft(eeg)/N</w:t>
         <w:br/>
@@ -2019,9 +2086,13 @@
         <w:t>ampl = 2*np.abs(X[:len(hz)]); ampl[0] /= 2</w:t>
         <w:br/>
         <w:br/>
+        <w:t># Phổ Welch: trung bình của FFT trên nhiều cửa sổ 1 s, overlap 50%</w:t>
+        <w:br/>
         <w:t>f_w, Pxx_w = scipy.signal.welch(eeg, fs, nperseg=fs, noverlap=fs//2)</w:t>
         <w:br/>
         <w:br/>
+        <w:t># 5 băng tần EEG sinh lý</w:t>
+        <w:br/>
         <w:t>bands = {'Delta':(0.5,4,'#9ecae1'), 'Theta':(4,8,'#a1d99b'),</w:t>
         <w:br/>
         <w:t xml:space="preserve">         'Alpha':(8,13,'#fdd0a2'), 'Beta':(13,30,'#fdae6b'),</w:t>
@@ -2030,24 +2101,40 @@
         <w:br/>
         <w:t>total = np.sum(ampl**2)</w:t>
         <w:br/>
+        <w:t>print('Phân bố năng lượng tương đối các băng tần:')</w:t>
+        <w:br/>
         <w:t>for name,(lo,hi,_) in bands.items():</w:t>
         <w:br/>
         <w:t xml:space="preserve">    mask = (hz&gt;=lo)&amp;(hz&lt;hi)</w:t>
         <w:br/>
-        <w:t xml:space="preserve">    print(f'{name}: {100*np.sum(ampl[mask]**2)/total:.2f}%')</w:t>
+        <w:t xml:space="preserve">    print(f'  {name}: {100*np.sum(ampl[mask]**2)/total:.2f}%')</w:t>
         <w:br/>
         <w:br/>
         <w:t>fig, axes = plt.subplots(3, 1, figsize=(11, 10))</w:t>
         <w:br/>
-        <w:t>axes[0].plot(t[:10*fs], eeg[:10*fs]); axes[0].set_title('10s dau')</w:t>
+        <w:t># Panel (a): 10 giây đầu của tín hiệu thời gian</w:t>
+        <w:br/>
+        <w:t>axes[0].plot(t[:10*fs], eeg[:10*fs])</w:t>
+        <w:br/>
+        <w:t>axes[0].set_xlabel('Thời gian (s)'); axes[0].set_ylabel('Biên độ (μV)')</w:t>
+        <w:br/>
+        <w:t>axes[0].set_title('(a) EEG nghỉ — 10 giây đầu')</w:t>
+        <w:br/>
+        <w:br/>
+        <w:t># Panel (b): FFT toàn cục với 5 băng tần tô màu</w:t>
         <w:br/>
         <w:t>for name,(lo,hi,c) in bands.items():</w:t>
         <w:br/>
         <w:t xml:space="preserve">    axes[1].axvspan(lo, hi, alpha=0.3, color=c, label=name)</w:t>
         <w:br/>
-        <w:t>axes[1].plot(hz, ampl, 'k'); axes[1].set_xlim([0, 70]); axes[1].legend(ncol=5)</w:t>
-        <w:br/>
-        <w:t>axes[1].set_title('FFT toan cuc')</w:t>
+        <w:t>axes[1].plot(hz, ampl, 'k'); axes[1].set_xlim([0, 70])</w:t>
+        <w:br/>
+        <w:t>axes[1].set_xlabel('Tần số (Hz)'); axes[1].set_ylabel('Biên độ')</w:t>
+        <w:br/>
+        <w:t>axes[1].set_title('(b) Phổ FFT toàn cục'); axes[1].legend(ncol=5)</w:t>
+        <w:br/>
+        <w:br/>
+        <w:t># Panel (c): phổ Welch log-scale (ổn định hơn FFT đơn)</w:t>
         <w:br/>
         <w:t>for name,(lo,hi,c) in bands.items():</w:t>
         <w:br/>
@@ -2055,7 +2142,9 @@
         <w:br/>
         <w:t>axes[2].semilogy(f_w, Pxx_w); axes[2].set_xlim([0, 70])</w:t>
         <w:br/>
-        <w:t>axes[2].set_title('Welch (log)')</w:t>
+        <w:t>axes[2].set_xlabel('Tần số (Hz)'); axes[2].set_ylabel('PSD (Welch, log)')</w:t>
+        <w:br/>
+        <w:t>axes[2].set_title('(c) Phổ Welch — ổn định hơn FFT đơn')</w:t>
         <w:br/>
         <w:t>plt.tight_layout(); plt.savefig('cau6_eeg.png', dpi=150); plt.show()</w:t>
         <w:br/>
@@ -2085,7 +2174,7 @@
         <w:br/>
         <w:drawing>
           <wp:inline xmlns:a="http://schemas.openxmlformats.org/drawingml/2006/main" xmlns:pic="http://schemas.openxmlformats.org/drawingml/2006/picture">
-            <wp:extent cx="5486400" cy="4975725"/>
+            <wp:extent cx="5486400" cy="4987636"/>
             <wp:docPr id="6" name="Picture 6"/>
             <wp:cNvGraphicFramePr>
               <a:graphicFrameLocks noChangeAspect="1"/>
@@ -2106,7 +2195,7 @@
                   <pic:spPr>
                     <a:xfrm>
                       <a:off x="0" y="0"/>
-                      <a:ext cx="5486400" cy="4975725"/>
+                      <a:ext cx="5486400" cy="4987636"/>
                     </a:xfrm>
                     <a:prstGeom prst="rect"/>
                   </pic:spPr>
@@ -2167,33 +2256,33 @@
         <w:rPr>
           <w:sz w:val="22"/>
         </w:rPr>
-        <w:t>Ket qua phan bo nang luong:</w:t>
-        <w:br/>
-        <w:t xml:space="preserve">  Delta (0.5-4 Hz):  43.44%   ← cao nhat</w:t>
-        <w:br/>
-        <w:t xml:space="preserve">  Theta (4-8 Hz):     8.13%</w:t>
-        <w:br/>
-        <w:t xml:space="preserve">  Alpha (8-13 Hz):   17.98%   ← noi bat thu hai</w:t>
-        <w:br/>
-        <w:t xml:space="preserve">  Beta (13-30 Hz):    8.28%</w:t>
-        <w:br/>
-        <w:t xml:space="preserve">  Gamma (30-70 Hz):  10.73%</w:t>
-        <w:br/>
-        <w:br/>
-        <w:t>Nhan xet va dien giai sinh ly:</w:t>
-        <w:br/>
-        <w:t>- Delta chiem uu the (43%) — trong EEG nghi mat nham, thanh phan tan rat thap (drift dien cuc, dao dong cham ~1-2 Hz cua mang neuron lon) thuong co bien do lon nhat. Day la dac trung pho bien cua single-channel raw EEG (chua loc HP).</w:t>
-        <w:br/>
-        <w:t>- Alpha (~18%) la dinh sinh ly noi bat thu hai — dac trung cua trang thai thu gian, tinh tao, mat nham. Khi sinh vien mo mat hoac tap trung, dinh nay se giam.</w:t>
-        <w:br/>
-        <w:t>- Beta (~8%) tuong ung voi hoat dong nhan thuc nen, Gamma (~11%) co the chua nhieu EMG (co mat/co tran).</w:t>
-        <w:br/>
-        <w:t>Welch on dinh hon FFT don (it noise floor) vi trung binh nhieu cua so → giam phuong sai uoc luong.</w:t>
-        <w:br/>
-        <w:br/>
-        <w:t>Tra loi cau hoi phu: Vi sao dinh Alpha 10 Hz thuong ro o vung cham khi nham mat?</w:t>
-        <w:br/>
-        <w:t>Vung cham (occipital cortex) chua vo thi giac so cap V1. Khi nham mat, dau vao thi giac giam manh, mang neuron V1 chuyen sang trang thai 'nghi' va phat ra dao dong dong bo tu phat o khoang 10 Hz (Alpha). Khi mo mat, V1 bi kich hoat → neuron phan tan → Alpha 'bien mat' (hien tuong alpha blocking, Berger 1924). Day la co so cua nhieu ung dung BCI dua tren EEG (cho phep dieu khien thiet bi bang trang thai nham/mo mat).</w:t>
+        <w:t>Kết quả phân bố năng lượng năm băng tần:</w:t>
+        <w:br/>
+        <w:t xml:space="preserve">  Delta (0.5 – 4 Hz):  43.44 %   ← cao nhất</w:t>
+        <w:br/>
+        <w:t xml:space="preserve">  Theta (4 – 8 Hz):     8.13 %</w:t>
+        <w:br/>
+        <w:t xml:space="preserve">  Alpha (8 – 13 Hz):   17.98 %   ← nổi bật thứ hai</w:t>
+        <w:br/>
+        <w:t xml:space="preserve">  Beta  (13 – 30 Hz):   8.28 %</w:t>
+        <w:br/>
+        <w:t xml:space="preserve">  Gamma (30 – 70 Hz): 10.73 %</w:t>
+        <w:br/>
+        <w:br/>
+        <w:t>Diễn giải sinh lý:</w:t>
+        <w:br/>
+        <w:t>- Delta chiếm ưu thế (~43 %) — trong tín hiệu EEG nghỉ mắt nhắm, các thành phần tần rất thấp (drift điện cực, dao động chậm ~1–2 Hz của các mạng neuron lớn) thường có biên độ lớn nhất. Đây là đặc trưng phổ biến của raw single-channel EEG khi chưa lọc thông cao trước khi phân tích.</w:t>
+        <w:br/>
+        <w:t>- Alpha (~18 %) là đỉnh sinh lý nổi bật thứ hai — đặc trưng của trạng thái thư giãn, tỉnh táo và mắt nhắm. Khi mở mắt hoặc tập trung nhận thức, đỉnh này sẽ giảm rõ (alpha blocking).</w:t>
+        <w:br/>
+        <w:t>- Beta (~8 %) tương ứng hoạt động nhận thức nền (xử lý suy nghĩ chủ động); Gamma (~11 %) có thể bao gồm cả nhiễu EMG (cơ mặt, cơ trán) lẫn vào tín hiệu EEG bề mặt.</w:t>
+        <w:br/>
+        <w:t>Phổ Welch ổn định hơn FFT đơn (ít noise floor, đường mịn) vì là trung bình của nhiều cửa sổ → giảm phương sai ước lượng phổ.</w:t>
+        <w:br/>
+        <w:br/>
+        <w:t>Trả lời câu hỏi phụ — Vì sao đỉnh Alpha 10 Hz thường rõ ở vùng chẩm khi nhắm mắt?</w:t>
+        <w:br/>
+        <w:t>Vùng chẩm (occipital cortex) chứa vỏ thị giác sơ cấp V1. Khi nhắm mắt, đầu vào thị giác giảm mạnh, mạng neuron V1 chuyển sang trạng thái "nghỉ" và phát ra dao động đồng bộ tự phát ở khoảng 10 Hz (Alpha). Khi mở mắt, V1 bị kích hoạt bởi đầu vào thị giác → các neuron phân tán pha → Alpha "biến mất" (hiện tượng alpha blocking, được Berger phát hiện năm 1924). Đây là cơ sở của nhiều ứng dụng BCI dựa trên EEG (điều khiển thiết bị bằng trạng thái nhắm/mở mắt).</w:t>
       </w:r>
     </w:p>
     <w:p>
@@ -2209,7 +2298,7 @@
         <w:rPr>
           <w:sz w:val="22"/>
         </w:rPr>
-        <w:t>Khong gap kho khan dang ke. Cac van de nho ve chuan hoa bien do (nhan 2 bin khong phai DC/Nyquist) va viec phai mirror bo loc Gauss qua tan so fs−f0 de giu tin hieu thuc da duoc giai quyet theo huong dan ly thuyet.</w:t>
+        <w:t>Không gặp khó khăn lớn. Một số chi tiết kỹ thuật cần chú ý đã được giải quyết theo lý thuyết: chuẩn hoá biên độ DFT (nhân 2 với bin không phải DC/Nyquist), thêm thành phần mirror tại (fs − f0) cho bộ lọc Gauss để đảm bảo tín hiệu sau lọc là số thực, và cài đặt pha của chirp tuyến tính bằng tích phân tần số tức thời.</w:t>
       </w:r>
     </w:p>
     <w:p>
@@ -2241,7 +2330,7 @@
         <w:rPr>
           <w:sz w:val="22"/>
         </w:rPr>
-        <w:t>Tai anh Lenna.png, FFT 2D va shift DC ve tam. Thiet ke bo loc Gauss 2D voi 3 muc σ=[0.05, 0.10, 0.20]. Tao anh low-pass (nhan voi G) va high-pass (nhan voi 1-G), tinh RMSE giua anh goc va anh sau low-pass. Ve bang 3×3 hien thi bo loc, anh low-pass va anh high-pass.</w:t>
+        <w:t>Đọc ảnh Lenna.png, chuyển grayscale bằng trung bình 3 kênh, tính FFT 2D và shift DC về tâm. Vẽ log|FFT2| và pha. Thiết kế bộ lọc Gauss 2D với 3 mức σ = [0.05, 0.10, 0.20]. Tạo ảnh low-pass (nhân với G) và ảnh high-pass (nhân với 1 − G), tính RMSE giữa ảnh gốc và ảnh sau low-pass. Vẽ bảng 3×2 hiển thị các kết quả và bàn luận lượng thông tin mất đi.</w:t>
       </w:r>
     </w:p>
     <w:p>
@@ -2257,19 +2346,19 @@
         <w:rPr>
           <w:sz w:val="22"/>
         </w:rPr>
-        <w:t>Buoc 1: Doc anh Lenna grayscale (512×512), chuyen float.</w:t>
-        <w:br/>
-        <w:t>Buoc 2: FFT 2D bang sfft.fft2 roi fftshift de DC ve tam.</w:t>
-        <w:br/>
-        <w:t>Buoc 3: Tao luoi toa do z-score chuan hoa: xr = zscore(arange(W)), yr = zscore(arange(H)), meshgrid.</w:t>
-        <w:br/>
-        <w:t>Buoc 4: Voi moi sigma ∈ {0.05, 0.10, 0.20}: G(u,v) = exp(−(u²+v²)/(2σ²)).</w:t>
-        <w:br/>
-        <w:t>Buoc 5: Low-pass: F·G; High-pass: F·(1−G). Khoi phuc anh bang ifftshift roi ifft2 va lay phan thuc.</w:t>
-        <w:br/>
-        <w:t>Buoc 6: RMSE = sqrt(mean((I − I_lp)²)).</w:t>
-        <w:br/>
-        <w:t>Buoc 7: Hien thi bang 3×3: bo loc, anh low-pass, anh high-pass.</w:t>
+        <w:t>Bước 1: Đọc ảnh Lenna grayscale 512×512 — chuyển grayscale bằng trung bình 3 kênh RGB theo đúng yêu cầu đề.</w:t>
+        <w:br/>
+        <w:t>Bước 2: FFT 2D bằng sfft.fft2 rồi fftshift để DC về tâm. Vẽ log|FFT2| và pha (pha hiển thị bằng colormap hsv để dải tuần hoàn rõ).</w:t>
+        <w:br/>
+        <w:t>Bước 3: Tạo lưới toạ độ z-score chuẩn hoá: xr = zscore(arange(W)), yr = zscore(arange(H)), meshgrid để có ma trận (X, Y) toạ độ chuẩn.</w:t>
+        <w:br/>
+        <w:t>Bước 4: Với mỗi σ ∈ {0.05, 0.10, 0.20}: tính G(u, v) = exp(−(u² + v²)/(2σ²)).</w:t>
+        <w:br/>
+        <w:t>Bước 5: Lọc thông thấp F·G; lọc thông cao F·(1 − G). Khôi phục ảnh: ifftshift rồi ifft2 và lấy phần thực.</w:t>
+        <w:br/>
+        <w:t>Bước 6: Tính RMSE = sqrt(mean((I − I_lp)²)) và phần trăm năng lượng giữ lại sau low-pass.</w:t>
+        <w:br/>
+        <w:t>Bước 7: Hiển thị bảng 3×2 (3 σ × 2 loại lọc).</w:t>
       </w:r>
     </w:p>
     <w:p>
@@ -2310,7 +2399,7 @@
           <w:rFonts w:ascii="Consolas" w:hAnsi="Consolas"/>
           <w:sz w:val="16"/>
         </w:rPr>
-        <w:t># CAU 7: Loc anh Gauss 2D</w:t>
+        <w:t># CÂU 7: Lọc ảnh Gauss 2D</w:t>
         <w:br/>
         <w:t>import numpy as np, matplotlib.pyplot as plt, scipy.fftpack as sfft</w:t>
         <w:br/>
@@ -2319,14 +2408,14 @@
         <w:t>from PIL import Image</w:t>
         <w:br/>
         <w:br/>
-        <w:t># Doc anh, chuyen grayscale = trung binh 3 kenh (theo de)</w:t>
+        <w:t># Đọc ảnh và chuyển grayscale bằng trung bình 3 kênh (theo yêu cầu đề)</w:t>
         <w:br/>
         <w:t>img_rgb = np.array(Image.open('Lenna.png').convert('RGB'), dtype=float)</w:t>
         <w:br/>
         <w:t>img = img_rgb.mean(axis=2)</w:t>
         <w:br/>
         <w:br/>
-        <w:t># FFT 2D va shift DC ve tam</w:t>
+        <w:t># FFT 2D và shift DC về tâm</w:t>
         <w:br/>
         <w:t>F = sfft.fftshift(sfft.fft2(img))</w:t>
         <w:br/>
@@ -2335,20 +2424,20 @@
         <w:t>phase = np.angle(F)</w:t>
         <w:br/>
         <w:br/>
-        <w:t># Hinh 1: anh goc, log|FFT2|, pha</w:t>
+        <w:t># Hình 1: ảnh gốc, log|FFT2|, pha</w:t>
         <w:br/>
         <w:t>fig1, ax1 = plt.subplots(1, 3, figsize=(15, 5))</w:t>
         <w:br/>
-        <w:t>ax1[0].imshow(img, cmap='gray'); ax1[0].set_title('Anh goc'); ax1[0].axis('off')</w:t>
-        <w:br/>
-        <w:t>ax1[1].imshow(log_mag, cmap='gray'); ax1[1].set_title('log|FFT2|'); ax1[1].axis('off')</w:t>
-        <w:br/>
-        <w:t>ax1[2].imshow(phase, cmap='hsv'); ax1[2].set_title('Pha'); ax1[2].axis('off')</w:t>
+        <w:t>ax1[0].imshow(img, cmap='gray'); ax1[0].set_title('Ảnh gốc (grayscale)'); ax1[0].axis('off')</w:t>
+        <w:br/>
+        <w:t>ax1[1].imshow(log_mag, cmap='gray'); ax1[1].set_title('log|FFT2| (DC ở tâm)'); ax1[1].axis('off')</w:t>
+        <w:br/>
+        <w:t>ax1[2].imshow(phase, cmap='hsv'); ax1[2].set_title('Pha FFT2'); ax1[2].axis('off')</w:t>
         <w:br/>
         <w:t>plt.tight_layout(); plt.savefig('cau7_pho_anh.png', dpi=150); plt.show()</w:t>
         <w:br/>
         <w:br/>
-        <w:t># Toa do chuan hoa (z-score) — DC o tam (0,0)</w:t>
+        <w:t># Toạ độ chuẩn hoá (z-score) — gốc DC nằm ở tâm</w:t>
         <w:br/>
         <w:t>xr = stats.zscore(np.arange(img.shape[1]))</w:t>
         <w:br/>
@@ -2357,7 +2446,7 @@
         <w:t>X, Y = np.meshgrid(xr, yr)</w:t>
         <w:br/>
         <w:br/>
-        <w:t># Hinh 2: bang 3x2 — 3 sigma cho low/high-pass</w:t>
+        <w:t># Hình 2: bảng 3×2 — 3 mức sigma cho lọc thông thấp và thông cao</w:t>
         <w:br/>
         <w:t>sigmas = [0.05, 0.10, 0.20]</w:t>
         <w:br/>
@@ -2367,27 +2456,27 @@
         <w:br/>
         <w:t>for i, s in enumerate(sigmas):</w:t>
         <w:br/>
-        <w:t xml:space="preserve">    G = np.exp(-(X**2+Y**2)/(2*s**2))</w:t>
+        <w:t xml:space="preserve">    G = np.exp(-(X**2+Y**2)/(2*s**2))             # Bộ lọc Gauss 2D</w:t>
         <w:br/>
         <w:t xml:space="preserve">    F_lp = F*G</w:t>
         <w:br/>
-        <w:t xml:space="preserve">    img_lp = np.real(sfft.ifft2(sfft.ifftshift(F_lp)))</w:t>
-        <w:br/>
-        <w:t xml:space="preserve">    img_hp = np.real(sfft.ifft2(sfft.ifftshift(F*(1-G))))</w:t>
+        <w:t xml:space="preserve">    img_lp = np.real(sfft.ifft2(sfft.ifftshift(F_lp)))  # Thông thấp</w:t>
+        <w:br/>
+        <w:t xml:space="preserve">    img_hp = np.real(sfft.ifft2(sfft.ifftshift(F*(1-G))))  # Thông cao = 1 - G</w:t>
         <w:br/>
         <w:t xml:space="preserve">    rmse = np.sqrt(np.mean((img-img_lp)**2))</w:t>
         <w:br/>
         <w:t xml:space="preserve">    retain = np.sum(np.abs(F_lp)**2)/total_energy * 100</w:t>
         <w:br/>
-        <w:t xml:space="preserve">    print(f'sigma={s}: RMSE={rmse:.2f}, giu {retain:.2f}% E')</w:t>
+        <w:t xml:space="preserve">    print(f'sigma = {s}: RMSE = {rmse:.2f}, giữ lại {retain:.2f}% năng lượng')</w:t>
         <w:br/>
         <w:t xml:space="preserve">    axes[i,0].imshow(img_lp, cmap='gray')</w:t>
         <w:br/>
-        <w:t xml:space="preserve">    axes[i,0].set_title(f'Low-pass σ={s} RMSE={rmse:.2f}, giu {retain:.1f}% E')</w:t>
+        <w:t xml:space="preserve">    axes[i,0].set_title(f'Low-pass σ = {s}  RMSE = {rmse:.2f}, giữ {retain:.1f}% E')</w:t>
         <w:br/>
         <w:t xml:space="preserve">    axes[i,1].imshow(img_hp, cmap='gray')</w:t>
         <w:br/>
-        <w:t xml:space="preserve">    axes[i,1].set_title(f'High-pass σ={s}')</w:t>
+        <w:t xml:space="preserve">    axes[i,1].set_title(f'High-pass σ = {s}')</w:t>
         <w:br/>
         <w:t xml:space="preserve">    for a in axes[i]: a.axis('off')</w:t>
         <w:br/>
@@ -2419,7 +2508,7 @@
         <w:br/>
         <w:drawing>
           <wp:inline xmlns:a="http://schemas.openxmlformats.org/drawingml/2006/main" xmlns:pic="http://schemas.openxmlformats.org/drawingml/2006/picture">
-            <wp:extent cx="5486400" cy="1892289"/>
+            <wp:extent cx="5486400" cy="1828800"/>
             <wp:docPr id="7" name="Picture 7"/>
             <wp:cNvGraphicFramePr>
               <a:graphicFrameLocks noChangeAspect="1"/>
@@ -2440,7 +2529,7 @@
                   <pic:spPr>
                     <a:xfrm>
                       <a:off x="0" y="0"/>
-                      <a:ext cx="5486400" cy="1892289"/>
+                      <a:ext cx="5486400" cy="1828800"/>
                     </a:xfrm>
                     <a:prstGeom prst="rect"/>
                   </pic:spPr>
@@ -2454,7 +2543,7 @@
         <w:br/>
         <w:drawing>
           <wp:inline xmlns:a="http://schemas.openxmlformats.org/drawingml/2006/main" xmlns:pic="http://schemas.openxmlformats.org/drawingml/2006/picture">
-            <wp:extent cx="5486400" cy="7782221"/>
+            <wp:extent cx="5486400" cy="6583680"/>
             <wp:docPr id="8" name="Picture 8"/>
             <wp:cNvGraphicFramePr>
               <a:graphicFrameLocks noChangeAspect="1"/>
@@ -2475,7 +2564,7 @@
                   <pic:spPr>
                     <a:xfrm>
                       <a:off x="0" y="0"/>
-                      <a:ext cx="5486400" cy="7782221"/>
+                      <a:ext cx="5486400" cy="6583680"/>
                     </a:xfrm>
                     <a:prstGeom prst="rect"/>
                   </pic:spPr>
@@ -2536,38 +2625,36 @@
         <w:rPr>
           <w:sz w:val="22"/>
         </w:rPr>
-        <w:t>Ket qua RMSE va % nang luong tan so giu lai sau low-pass:</w:t>
-        <w:br/>
-        <w:t xml:space="preserve">  σ=0.05: RMSE=22.50, giu 94.37% E  (lam mo nhieu, mat chi tiet rieng nhung van giu phan lon nang luong tan thap)</w:t>
-        <w:br/>
-        <w:t xml:space="preserve">  σ=0.10: RMSE=16.39, giu 96.88% E  (mo vua phai)</w:t>
-        <w:br/>
-        <w:t xml:space="preserve">  σ=0.20: RMSE=11.38, giu 98.33% E  (mo nhe, giu duoc nhieu chi tiet)</w:t>
-        <w:br/>
-        <w:br/>
-        <w:t>Quan sat anh pho:</w:t>
-        <w:br/>
-        <w:t>- log|FFT2| co diem sang manh o tam (DC) va lan giam dan ra ngoai (tan cao), kem theo vai tia sang doc/ngang ung voi cac canh sac nhe co dinh huong trong anh.</w:t>
-        <w:br/>
-        <w:t>- Pha trong xu ly anh chua phan lon thong tin cau truc — neu hoan doi pha cua 2 anh khac nhau ta thay anh khoi phuc theo pha, KHONG theo bien do.</w:t>
-        <w:br/>
-        <w:br/>
-        <w:t>Bàn luận về mất thông tin:</w:t>
-        <w:br/>
-        <w:t>- σ=0.05 chi mat 5.6% nang luong nhung RMSE lai cao (~22) — chung to nang luong tan cao tuy nho ve trong so nhung quan trong ve do nhan thuc (perceptual): chinh la canh, texture, chi tiet. Mat 5% E nay ma anh trong rat mo, doc/nhin kho.</w:t>
-        <w:br/>
-        <w:t>- Tang σ tu 0.05→0.20: RMSE giam ~50% (22→11) trong khi % nang luong giu tang it (94→98%) → quan he phi tuyen giua nang luong tan so va chat luong cam nhan.</w:t>
-        <w:br/>
-        <w:t>- High-pass (F·(1-G)) cho thay anh viền/canh; σ cang nho thi vien cang day cau truc, σ lon thi chi con bien gioi manh.</w:t>
-        <w:br/>
-        <w:br/>
-        <w:t>Tra loi cau hoi phu: HAI ung dung khac cua loc Gauss 2D (ngoai blur va sharpen):</w:t>
-        <w:br/>
-        <w:t>1. Tien xu ly cho phat hien canh: thuat toan Canny dung Gauss 2D smooth truoc khi tinh gradient de giam nhieu — vi gradient rat nhay voi nhieu, khong smooth se sinh ra nhieu canh gia. Tuong tu, Laplacian-of-Gaussian (LoG) va Difference-of-Gaussian (DoG) la nen tang cua SIFT/SURF cho matching va dinh vi diem dac trung.</w:t>
-        <w:br/>
-        <w:t>2. Xay dung kim tu thap Gauss (Gaussian pyramid) va Laplacian pyramid trong nen anh (image compression), tron anh (image blending), va multi-scale analysis. Apple/Google su dung pyramid blending cho panorama va portrait mode.</w:t>
-        <w:br/>
-        <w:t>3. Bonus: noise reduction trong y khoa (MRI, CT) — Gauss isotropic 2D la xap xi optimal cho nhieu Gaussian voi gia thiet cau truc khong huong (di nhien voi cau truc co huong nguoi ta dung anisotropic diffusion).</w:t>
+        <w:t>Kết quả RMSE và phần trăm năng lượng tần số giữ lại sau low-pass:</w:t>
+        <w:br/>
+        <w:t xml:space="preserve">  σ = 0.05: RMSE = 22.50, giữ 94.37 % năng lượng (làm mờ nhiều, mất chi tiết nhưng vẫn giữ phần lớn năng lượng tần thấp)</w:t>
+        <w:br/>
+        <w:t xml:space="preserve">  σ = 0.10: RMSE = 16.39, giữ 96.88 % năng lượng (mờ vừa phải)</w:t>
+        <w:br/>
+        <w:t xml:space="preserve">  σ = 0.20: RMSE = 11.38, giữ 98.33 % năng lượng (mờ nhẹ, giữ được nhiều chi tiết)</w:t>
+        <w:br/>
+        <w:br/>
+        <w:t>Quan sát ảnh phổ (log|FFT2| và pha):</w:t>
+        <w:br/>
+        <w:t>- log|FFT2| có điểm sáng mạnh ở tâm (DC) và lan giảm dần ra ngoài (tần số cao), kèm vài tia sáng dọc và ngang ứng với các cạnh sắc có định hướng trong ảnh.</w:t>
+        <w:br/>
+        <w:t>- Pha trong xử lý ảnh thực ra chứa phần lớn thông tin cấu trúc — kinh nghiệm cổ điển: nếu ta hoán đổi pha của hai ảnh khác nhau, ảnh khôi phục sẽ thể hiện cấu trúc theo pha chứ không phải theo biên độ.</w:t>
+        <w:br/>
+        <w:br/>
+        <w:t>Bàn luận về lượng thông tin mất đi:</w:t>
+        <w:br/>
+        <w:t>- σ = 0.05 chỉ mất 5.6 % năng lượng nhưng RMSE lại cao (~22) — chứng tỏ năng lượng tần cao tuy nhỏ về tỷ trọng nhưng quan trọng về cảm nhận (perceptual): đó chính là cạnh, texture, chi tiết. Mất 5 % năng lượng này khiến ảnh trông rất mờ và khó đọc.</w:t>
+        <w:br/>
+        <w:t>- Khi tăng σ từ 0.05 lên 0.20: RMSE giảm khoảng 50 % (22 → 11) trong khi tỷ lệ năng lượng giữ lại chỉ tăng ít (94 → 98 %) → quan hệ phi tuyến giữa năng lượng tần số và chất lượng cảm nhận.</w:t>
+        <w:br/>
+        <w:t>- Ảnh high-pass (F·(1 − G)) làm nổi viền và cạnh; σ càng nhỏ thì viền càng dày cấu trúc, σ càng lớn thì chỉ còn biên giới mạnh.</w:t>
+        <w:br/>
+        <w:br/>
+        <w:t>Trả lời câu hỏi phụ — HAI ứng dụng khác của lọc Gauss 2D (ngoài làm mờ và làm sắc biên):</w:t>
+        <w:br/>
+        <w:t>1. Tiền xử lý cho phát hiện cạnh và đặc trưng: thuật toán Canny dùng Gauss 2D smooth ảnh trước khi tính gradient để giảm nhiễu — gradient rất nhạy với nhiễu, nếu không smooth sẽ sinh nhiều cạnh giả. Tương tự, Laplacian-of-Gaussian (LoG) và Difference-of-Gaussian (DoG) là nền tảng của các bộ phát hiện đặc trưng đa thang đo như SIFT/SURF dùng cho matching ảnh và stitching panorama.</w:t>
+        <w:br/>
+        <w:t>2. Xây dựng kim tự tháp Gauss (Gaussian pyramid) và Laplacian pyramid trong nén ảnh có mất mát, blend ảnh đa giải, và phân tích đa thang đo. Các ứng dụng thương mại nổi tiếng: Apple/Google dùng pyramid blending cho chế độ chân dung và panorama trên điện thoại, đồng thời pyramid là backbone của nhiều mạng nơ-ron tích chập đa thang đo trong thị giác máy tính.</w:t>
       </w:r>
     </w:p>
     <w:p>
@@ -2583,7 +2670,7 @@
         <w:rPr>
           <w:sz w:val="22"/>
         </w:rPr>
-        <w:t>Khong gap kho khan dang ke. Cac van de nho ve chuan hoa bien do (nhan 2 bin khong phai DC/Nyquist) va viec phai mirror bo loc Gauss qua tan so fs−f0 de giu tin hieu thuc da duoc giai quyet theo huong dan ly thuyet.</w:t>
+        <w:t>Không gặp khó khăn lớn. Một số chi tiết kỹ thuật cần chú ý đã được giải quyết theo lý thuyết: chuẩn hoá biên độ DFT (nhân 2 với bin không phải DC/Nyquist), thêm thành phần mirror tại (fs − f0) cho bộ lọc Gauss để đảm bảo tín hiệu sau lọc là số thực, và cài đặt pha của chirp tuyến tính bằng tích phân tần số tức thời.</w:t>
       </w:r>
     </w:p>
     <w:p>
@@ -2615,7 +2702,7 @@
         <w:rPr>
           <w:sz w:val="22"/>
         </w:rPr>
-        <w:t>Tai anh Lenna.png, FFT 2D va shift DC ve tam. Thiet ke bo loc Gauss 2D voi 3 muc σ=[0.05, 0.10, 0.20]. Tao anh low-pass (nhan voi G) va high-pass (nhan voi 1-G), tinh RMSE giua anh goc va anh sau low-pass. Ve bang 3×3 hien thi bo loc, anh low-pass va anh high-pass.</w:t>
+        <w:t>Đọc ảnh Lenna.png, chuyển grayscale bằng trung bình 3 kênh, tính FFT 2D và shift DC về tâm. Vẽ log|FFT2| và pha. Thiết kế bộ lọc Gauss 2D với 3 mức σ = [0.05, 0.10, 0.20]. Tạo ảnh low-pass (nhân với G) và ảnh high-pass (nhân với 1 − G), tính RMSE giữa ảnh gốc và ảnh sau low-pass. Vẽ bảng 3×2 hiển thị các kết quả và bàn luận lượng thông tin mất đi.</w:t>
       </w:r>
     </w:p>
     <w:p>
@@ -2631,19 +2718,19 @@
         <w:rPr>
           <w:sz w:val="22"/>
         </w:rPr>
-        <w:t>Buoc 1: Doc anh Lenna grayscale (512×512), chuyen float.</w:t>
-        <w:br/>
-        <w:t>Buoc 2: FFT 2D bang sfft.fft2 roi fftshift de DC ve tam.</w:t>
-        <w:br/>
-        <w:t>Buoc 3: Tao luoi toa do z-score chuan hoa: xr = zscore(arange(W)), yr = zscore(arange(H)), meshgrid.</w:t>
-        <w:br/>
-        <w:t>Buoc 4: Voi moi sigma ∈ {0.05, 0.10, 0.20}: G(u,v) = exp(−(u²+v²)/(2σ²)).</w:t>
-        <w:br/>
-        <w:t>Buoc 5: Low-pass: F·G; High-pass: F·(1−G). Khoi phuc anh bang ifftshift roi ifft2 va lay phan thuc.</w:t>
-        <w:br/>
-        <w:t>Buoc 6: RMSE = sqrt(mean((I − I_lp)²)).</w:t>
-        <w:br/>
-        <w:t>Buoc 7: Hien thi bang 3×3: bo loc, anh low-pass, anh high-pass.</w:t>
+        <w:t>Bước 1: Đọc ảnh Lenna grayscale 512×512 — chuyển grayscale bằng trung bình 3 kênh RGB theo đúng yêu cầu đề.</w:t>
+        <w:br/>
+        <w:t>Bước 2: FFT 2D bằng sfft.fft2 rồi fftshift để DC về tâm. Vẽ log|FFT2| và pha (pha hiển thị bằng colormap hsv để dải tuần hoàn rõ).</w:t>
+        <w:br/>
+        <w:t>Bước 3: Tạo lưới toạ độ z-score chuẩn hoá: xr = zscore(arange(W)), yr = zscore(arange(H)), meshgrid để có ma trận (X, Y) toạ độ chuẩn.</w:t>
+        <w:br/>
+        <w:t>Bước 4: Với mỗi σ ∈ {0.05, 0.10, 0.20}: tính G(u, v) = exp(−(u² + v²)/(2σ²)).</w:t>
+        <w:br/>
+        <w:t>Bước 5: Lọc thông thấp F·G; lọc thông cao F·(1 − G). Khôi phục ảnh: ifftshift rồi ifft2 và lấy phần thực.</w:t>
+        <w:br/>
+        <w:t>Bước 6: Tính RMSE = sqrt(mean((I − I_lp)²)) và phần trăm năng lượng giữ lại sau low-pass.</w:t>
+        <w:br/>
+        <w:t>Bước 7: Hiển thị bảng 3×2 (3 σ × 2 loại lọc).</w:t>
       </w:r>
     </w:p>
     <w:p>

</xml_diff>

<commit_message>
Chen anh vao dung table khung anh thay cho placeholder
</commit_message>
<xml_diff>
--- a/DSP_BienDoiFourier_BaoCao_HoanChinh.docx
+++ b/DSP_BienDoiFourier_BaoCao_HoanChinh.docx
@@ -616,41 +616,6 @@
         </w:rPr>
         <w:t>Chụp toàn bộ figure đầu ra. Đảm bảo rõ trục, tiêu đề, legend.</w:t>
       </w:r>
-      <w:r>
-        <w:br/>
-        <w:drawing>
-          <wp:inline xmlns:a="http://schemas.openxmlformats.org/drawingml/2006/main" xmlns:pic="http://schemas.openxmlformats.org/drawingml/2006/picture">
-            <wp:extent cx="5486400" cy="2992582"/>
-            <wp:docPr id="1" name="Picture 1"/>
-            <wp:cNvGraphicFramePr>
-              <a:graphicFrameLocks noChangeAspect="1"/>
-            </wp:cNvGraphicFramePr>
-            <a:graphic>
-              <a:graphicData uri="http://schemas.openxmlformats.org/drawingml/2006/picture">
-                <pic:pic>
-                  <pic:nvPicPr>
-                    <pic:cNvPr id="0" name="cau1_pho.png"/>
-                    <pic:cNvPicPr/>
-                  </pic:nvPicPr>
-                  <pic:blipFill>
-                    <a:blip r:embed="rId9"/>
-                    <a:stretch>
-                      <a:fillRect/>
-                    </a:stretch>
-                  </pic:blipFill>
-                  <pic:spPr>
-                    <a:xfrm>
-                      <a:off x="0" y="0"/>
-                      <a:ext cx="5486400" cy="2992582"/>
-                    </a:xfrm>
-                    <a:prstGeom prst="rect"/>
-                  </pic:spPr>
-                </pic:pic>
-              </a:graphicData>
-            </a:graphic>
-          </wp:inline>
-        </w:drawing>
-      </w:r>
     </w:p>
     <w:tbl>
       <w:tblPr>
@@ -668,22 +633,39 @@
             <w:tcW w:w="8500" w:type="dxa"/>
           </w:tcPr>
           <w:p>
-            <w:pPr>
-              <w:jc w:val="center"/>
-            </w:pPr>
             <w:r>
-              <w:rPr>
-                <w:i/>
-                <w:color w:val="808080"/>
-              </w:rPr>
-              <w:br/>
-              <w:br/>
-              <w:t>[ Ảnh chụp kết quả câu 1 ]</w:t>
-              <w:br/>
-              <w:br/>
-              <w:t>Chèn ảnh: Insert → Picture → From File</w:t>
-              <w:br/>
-              <w:br/>
+              <w:drawing>
+                <wp:inline xmlns:a="http://schemas.openxmlformats.org/drawingml/2006/main" xmlns:pic="http://schemas.openxmlformats.org/drawingml/2006/picture">
+                  <wp:extent cx="5486400" cy="2992582"/>
+                  <wp:docPr id="1" name="Picture 1"/>
+                  <wp:cNvGraphicFramePr>
+                    <a:graphicFrameLocks noChangeAspect="1"/>
+                  </wp:cNvGraphicFramePr>
+                  <a:graphic>
+                    <a:graphicData uri="http://schemas.openxmlformats.org/drawingml/2006/picture">
+                      <pic:pic>
+                        <pic:nvPicPr>
+                          <pic:cNvPr id="0" name="cau1_pho.png"/>
+                          <pic:cNvPicPr/>
+                        </pic:nvPicPr>
+                        <pic:blipFill>
+                          <a:blip r:embed="rId9"/>
+                          <a:stretch>
+                            <a:fillRect/>
+                          </a:stretch>
+                        </pic:blipFill>
+                        <pic:spPr>
+                          <a:xfrm>
+                            <a:off x="0" y="0"/>
+                            <a:ext cx="5486400" cy="2992582"/>
+                          </a:xfrm>
+                          <a:prstGeom prst="rect"/>
+                        </pic:spPr>
+                      </pic:pic>
+                    </a:graphicData>
+                  </a:graphic>
+                </wp:inline>
+              </w:drawing>
             </w:r>
           </w:p>
         </w:tc>
@@ -922,41 +904,6 @@
         </w:rPr>
         <w:t>Chụp toàn bộ figure đầu ra. Đảm bảo rõ trục, tiêu đề, legend.</w:t>
       </w:r>
-      <w:r>
-        <w:br/>
-        <w:drawing>
-          <wp:inline xmlns:a="http://schemas.openxmlformats.org/drawingml/2006/main" xmlns:pic="http://schemas.openxmlformats.org/drawingml/2006/picture">
-            <wp:extent cx="5486400" cy="2110154"/>
-            <wp:docPr id="2" name="Picture 2"/>
-            <wp:cNvGraphicFramePr>
-              <a:graphicFrameLocks noChangeAspect="1"/>
-            </wp:cNvGraphicFramePr>
-            <a:graphic>
-              <a:graphicData uri="http://schemas.openxmlformats.org/drawingml/2006/picture">
-                <pic:pic>
-                  <pic:nvPicPr>
-                    <pic:cNvPr id="0" name="cau2_tocdo.png"/>
-                    <pic:cNvPicPr/>
-                  </pic:nvPicPr>
-                  <pic:blipFill>
-                    <a:blip r:embed="rId10"/>
-                    <a:stretch>
-                      <a:fillRect/>
-                    </a:stretch>
-                  </pic:blipFill>
-                  <pic:spPr>
-                    <a:xfrm>
-                      <a:off x="0" y="0"/>
-                      <a:ext cx="5486400" cy="2110154"/>
-                    </a:xfrm>
-                    <a:prstGeom prst="rect"/>
-                  </pic:spPr>
-                </pic:pic>
-              </a:graphicData>
-            </a:graphic>
-          </wp:inline>
-        </w:drawing>
-      </w:r>
     </w:p>
     <w:tbl>
       <w:tblPr>
@@ -974,22 +921,39 @@
             <w:tcW w:w="8500" w:type="dxa"/>
           </w:tcPr>
           <w:p>
-            <w:pPr>
-              <w:jc w:val="center"/>
-            </w:pPr>
             <w:r>
-              <w:rPr>
-                <w:i/>
-                <w:color w:val="808080"/>
-              </w:rPr>
-              <w:br/>
-              <w:br/>
-              <w:t>[ Ảnh chụp kết quả câu 2 ]</w:t>
-              <w:br/>
-              <w:br/>
-              <w:t>Chèn ảnh: Insert → Picture → From File</w:t>
-              <w:br/>
-              <w:br/>
+              <w:drawing>
+                <wp:inline xmlns:a="http://schemas.openxmlformats.org/drawingml/2006/main" xmlns:pic="http://schemas.openxmlformats.org/drawingml/2006/picture">
+                  <wp:extent cx="5486400" cy="2110154"/>
+                  <wp:docPr id="2" name="Picture 2"/>
+                  <wp:cNvGraphicFramePr>
+                    <a:graphicFrameLocks noChangeAspect="1"/>
+                  </wp:cNvGraphicFramePr>
+                  <a:graphic>
+                    <a:graphicData uri="http://schemas.openxmlformats.org/drawingml/2006/picture">
+                      <pic:pic>
+                        <pic:nvPicPr>
+                          <pic:cNvPr id="0" name="cau2_tocdo.png"/>
+                          <pic:cNvPicPr/>
+                        </pic:nvPicPr>
+                        <pic:blipFill>
+                          <a:blip r:embed="rId10"/>
+                          <a:stretch>
+                            <a:fillRect/>
+                          </a:stretch>
+                        </pic:blipFill>
+                        <pic:spPr>
+                          <a:xfrm>
+                            <a:off x="0" y="0"/>
+                            <a:ext cx="5486400" cy="2110154"/>
+                          </a:xfrm>
+                          <a:prstGeom prst="rect"/>
+                        </pic:spPr>
+                      </pic:pic>
+                    </a:graphicData>
+                  </a:graphic>
+                </wp:inline>
+              </w:drawing>
             </w:r>
           </w:p>
         </w:tc>
@@ -1227,41 +1191,6 @@
         </w:rPr>
         <w:t>Chụp toàn bộ figure đầu ra. Đảm bảo rõ trục, tiêu đề, legend.</w:t>
       </w:r>
-      <w:r>
-        <w:br/>
-        <w:drawing>
-          <wp:inline xmlns:a="http://schemas.openxmlformats.org/drawingml/2006/main" xmlns:pic="http://schemas.openxmlformats.org/drawingml/2006/picture">
-            <wp:extent cx="5486400" cy="4220308"/>
-            <wp:docPr id="3" name="Picture 3"/>
-            <wp:cNvGraphicFramePr>
-              <a:graphicFrameLocks noChangeAspect="1"/>
-            </wp:cNvGraphicFramePr>
-            <a:graphic>
-              <a:graphicData uri="http://schemas.openxmlformats.org/drawingml/2006/picture">
-                <pic:pic>
-                  <pic:nvPicPr>
-                    <pic:cNvPr id="0" name="cau3_aliasing.png"/>
-                    <pic:cNvPicPr/>
-                  </pic:nvPicPr>
-                  <pic:blipFill>
-                    <a:blip r:embed="rId11"/>
-                    <a:stretch>
-                      <a:fillRect/>
-                    </a:stretch>
-                  </pic:blipFill>
-                  <pic:spPr>
-                    <a:xfrm>
-                      <a:off x="0" y="0"/>
-                      <a:ext cx="5486400" cy="4220308"/>
-                    </a:xfrm>
-                    <a:prstGeom prst="rect"/>
-                  </pic:spPr>
-                </pic:pic>
-              </a:graphicData>
-            </a:graphic>
-          </wp:inline>
-        </w:drawing>
-      </w:r>
     </w:p>
     <w:tbl>
       <w:tblPr>
@@ -1279,22 +1208,39 @@
             <w:tcW w:w="8500" w:type="dxa"/>
           </w:tcPr>
           <w:p>
-            <w:pPr>
-              <w:jc w:val="center"/>
-            </w:pPr>
             <w:r>
-              <w:rPr>
-                <w:i/>
-                <w:color w:val="808080"/>
-              </w:rPr>
-              <w:br/>
-              <w:br/>
-              <w:t>[ Ảnh chụp kết quả câu 3 ]</w:t>
-              <w:br/>
-              <w:br/>
-              <w:t>Chèn ảnh: Insert → Picture → From File</w:t>
-              <w:br/>
-              <w:br/>
+              <w:drawing>
+                <wp:inline xmlns:a="http://schemas.openxmlformats.org/drawingml/2006/main" xmlns:pic="http://schemas.openxmlformats.org/drawingml/2006/picture">
+                  <wp:extent cx="5486400" cy="4220308"/>
+                  <wp:docPr id="3" name="Picture 3"/>
+                  <wp:cNvGraphicFramePr>
+                    <a:graphicFrameLocks noChangeAspect="1"/>
+                  </wp:cNvGraphicFramePr>
+                  <a:graphic>
+                    <a:graphicData uri="http://schemas.openxmlformats.org/drawingml/2006/picture">
+                      <pic:pic>
+                        <pic:nvPicPr>
+                          <pic:cNvPr id="0" name="cau3_aliasing.png"/>
+                          <pic:cNvPicPr/>
+                        </pic:nvPicPr>
+                        <pic:blipFill>
+                          <a:blip r:embed="rId11"/>
+                          <a:stretch>
+                            <a:fillRect/>
+                          </a:stretch>
+                        </pic:blipFill>
+                        <pic:spPr>
+                          <a:xfrm>
+                            <a:off x="0" y="0"/>
+                            <a:ext cx="5486400" cy="4220308"/>
+                          </a:xfrm>
+                          <a:prstGeom prst="rect"/>
+                        </pic:spPr>
+                      </pic:pic>
+                    </a:graphicData>
+                  </a:graphic>
+                </wp:inline>
+              </w:drawing>
             </w:r>
           </w:p>
         </w:tc>
@@ -1549,41 +1495,6 @@
         </w:rPr>
         <w:t>Chụp toàn bộ figure đầu ra. Đảm bảo rõ trục, tiêu đề, legend.</w:t>
       </w:r>
-      <w:r>
-        <w:br/>
-        <w:drawing>
-          <wp:inline xmlns:a="http://schemas.openxmlformats.org/drawingml/2006/main" xmlns:pic="http://schemas.openxmlformats.org/drawingml/2006/picture">
-            <wp:extent cx="5486400" cy="4488873"/>
-            <wp:docPr id="4" name="Picture 4"/>
-            <wp:cNvGraphicFramePr>
-              <a:graphicFrameLocks noChangeAspect="1"/>
-            </wp:cNvGraphicFramePr>
-            <a:graphic>
-              <a:graphicData uri="http://schemas.openxmlformats.org/drawingml/2006/picture">
-                <pic:pic>
-                  <pic:nvPicPr>
-                    <pic:cNvPr id="0" name="cau4_loc.png"/>
-                    <pic:cNvPicPr/>
-                  </pic:nvPicPr>
-                  <pic:blipFill>
-                    <a:blip r:embed="rId12"/>
-                    <a:stretch>
-                      <a:fillRect/>
-                    </a:stretch>
-                  </pic:blipFill>
-                  <pic:spPr>
-                    <a:xfrm>
-                      <a:off x="0" y="0"/>
-                      <a:ext cx="5486400" cy="4488873"/>
-                    </a:xfrm>
-                    <a:prstGeom prst="rect"/>
-                  </pic:spPr>
-                </pic:pic>
-              </a:graphicData>
-            </a:graphic>
-          </wp:inline>
-        </w:drawing>
-      </w:r>
     </w:p>
     <w:tbl>
       <w:tblPr>
@@ -1601,22 +1512,39 @@
             <w:tcW w:w="8500" w:type="dxa"/>
           </w:tcPr>
           <w:p>
-            <w:pPr>
-              <w:jc w:val="center"/>
-            </w:pPr>
             <w:r>
-              <w:rPr>
-                <w:i/>
-                <w:color w:val="808080"/>
-              </w:rPr>
-              <w:br/>
-              <w:br/>
-              <w:t>[ Ảnh chụp kết quả câu 4 ]</w:t>
-              <w:br/>
-              <w:br/>
-              <w:t>Chèn ảnh: Insert → Picture → From File</w:t>
-              <w:br/>
-              <w:br/>
+              <w:drawing>
+                <wp:inline xmlns:a="http://schemas.openxmlformats.org/drawingml/2006/main" xmlns:pic="http://schemas.openxmlformats.org/drawingml/2006/picture">
+                  <wp:extent cx="5486400" cy="4488873"/>
+                  <wp:docPr id="4" name="Picture 4"/>
+                  <wp:cNvGraphicFramePr>
+                    <a:graphicFrameLocks noChangeAspect="1"/>
+                  </wp:cNvGraphicFramePr>
+                  <a:graphic>
+                    <a:graphicData uri="http://schemas.openxmlformats.org/drawingml/2006/picture">
+                      <pic:pic>
+                        <pic:nvPicPr>
+                          <pic:cNvPr id="0" name="cau4_loc.png"/>
+                          <pic:cNvPicPr/>
+                        </pic:nvPicPr>
+                        <pic:blipFill>
+                          <a:blip r:embed="rId12"/>
+                          <a:stretch>
+                            <a:fillRect/>
+                          </a:stretch>
+                        </pic:blipFill>
+                        <pic:spPr>
+                          <a:xfrm>
+                            <a:off x="0" y="0"/>
+                            <a:ext cx="5486400" cy="4488873"/>
+                          </a:xfrm>
+                          <a:prstGeom prst="rect"/>
+                        </pic:spPr>
+                      </pic:pic>
+                    </a:graphicData>
+                  </a:graphic>
+                </wp:inline>
+              </w:drawing>
             </w:r>
           </w:p>
         </w:tc>
@@ -1846,41 +1774,6 @@
         </w:rPr>
         <w:t>Chụp toàn bộ figure đầu ra. Đảm bảo rõ trục, tiêu đề, legend.</w:t>
       </w:r>
-      <w:r>
-        <w:br/>
-        <w:drawing>
-          <wp:inline xmlns:a="http://schemas.openxmlformats.org/drawingml/2006/main" xmlns:pic="http://schemas.openxmlformats.org/drawingml/2006/picture">
-            <wp:extent cx="5486400" cy="5486400"/>
-            <wp:docPr id="5" name="Picture 5"/>
-            <wp:cNvGraphicFramePr>
-              <a:graphicFrameLocks noChangeAspect="1"/>
-            </wp:cNvGraphicFramePr>
-            <a:graphic>
-              <a:graphicData uri="http://schemas.openxmlformats.org/drawingml/2006/picture">
-                <pic:pic>
-                  <pic:nvPicPr>
-                    <pic:cNvPr id="0" name="cau5_stft.png"/>
-                    <pic:cNvPicPr/>
-                  </pic:nvPicPr>
-                  <pic:blipFill>
-                    <a:blip r:embed="rId13"/>
-                    <a:stretch>
-                      <a:fillRect/>
-                    </a:stretch>
-                  </pic:blipFill>
-                  <pic:spPr>
-                    <a:xfrm>
-                      <a:off x="0" y="0"/>
-                      <a:ext cx="5486400" cy="5486400"/>
-                    </a:xfrm>
-                    <a:prstGeom prst="rect"/>
-                  </pic:spPr>
-                </pic:pic>
-              </a:graphicData>
-            </a:graphic>
-          </wp:inline>
-        </w:drawing>
-      </w:r>
     </w:p>
     <w:tbl>
       <w:tblPr>
@@ -1898,22 +1791,39 @@
             <w:tcW w:w="8500" w:type="dxa"/>
           </w:tcPr>
           <w:p>
-            <w:pPr>
-              <w:jc w:val="center"/>
-            </w:pPr>
             <w:r>
-              <w:rPr>
-                <w:i/>
-                <w:color w:val="808080"/>
-              </w:rPr>
-              <w:br/>
-              <w:br/>
-              <w:t>[ Ảnh chụp kết quả câu 5 ]</w:t>
-              <w:br/>
-              <w:br/>
-              <w:t>Chèn ảnh: Insert → Picture → From File</w:t>
-              <w:br/>
-              <w:br/>
+              <w:drawing>
+                <wp:inline xmlns:a="http://schemas.openxmlformats.org/drawingml/2006/main" xmlns:pic="http://schemas.openxmlformats.org/drawingml/2006/picture">
+                  <wp:extent cx="5486400" cy="5486400"/>
+                  <wp:docPr id="5" name="Picture 5"/>
+                  <wp:cNvGraphicFramePr>
+                    <a:graphicFrameLocks noChangeAspect="1"/>
+                  </wp:cNvGraphicFramePr>
+                  <a:graphic>
+                    <a:graphicData uri="http://schemas.openxmlformats.org/drawingml/2006/picture">
+                      <pic:pic>
+                        <pic:nvPicPr>
+                          <pic:cNvPr id="0" name="cau5_stft.png"/>
+                          <pic:cNvPicPr/>
+                        </pic:nvPicPr>
+                        <pic:blipFill>
+                          <a:blip r:embed="rId13"/>
+                          <a:stretch>
+                            <a:fillRect/>
+                          </a:stretch>
+                        </pic:blipFill>
+                        <pic:spPr>
+                          <a:xfrm>
+                            <a:off x="0" y="0"/>
+                            <a:ext cx="5486400" cy="5486400"/>
+                          </a:xfrm>
+                          <a:prstGeom prst="rect"/>
+                        </pic:spPr>
+                      </pic:pic>
+                    </a:graphicData>
+                  </a:graphic>
+                </wp:inline>
+              </w:drawing>
             </w:r>
           </w:p>
         </w:tc>
@@ -2170,41 +2080,6 @@
         </w:rPr>
         <w:t>Chụp toàn bộ figure đầu ra. Đảm bảo rõ trục, tiêu đề, legend.</w:t>
       </w:r>
-      <w:r>
-        <w:br/>
-        <w:drawing>
-          <wp:inline xmlns:a="http://schemas.openxmlformats.org/drawingml/2006/main" xmlns:pic="http://schemas.openxmlformats.org/drawingml/2006/picture">
-            <wp:extent cx="5486400" cy="4987636"/>
-            <wp:docPr id="6" name="Picture 6"/>
-            <wp:cNvGraphicFramePr>
-              <a:graphicFrameLocks noChangeAspect="1"/>
-            </wp:cNvGraphicFramePr>
-            <a:graphic>
-              <a:graphicData uri="http://schemas.openxmlformats.org/drawingml/2006/picture">
-                <pic:pic>
-                  <pic:nvPicPr>
-                    <pic:cNvPr id="0" name="cau6_eeg.png"/>
-                    <pic:cNvPicPr/>
-                  </pic:nvPicPr>
-                  <pic:blipFill>
-                    <a:blip r:embed="rId14"/>
-                    <a:stretch>
-                      <a:fillRect/>
-                    </a:stretch>
-                  </pic:blipFill>
-                  <pic:spPr>
-                    <a:xfrm>
-                      <a:off x="0" y="0"/>
-                      <a:ext cx="5486400" cy="4987636"/>
-                    </a:xfrm>
-                    <a:prstGeom prst="rect"/>
-                  </pic:spPr>
-                </pic:pic>
-              </a:graphicData>
-            </a:graphic>
-          </wp:inline>
-        </w:drawing>
-      </w:r>
     </w:p>
     <w:tbl>
       <w:tblPr>
@@ -2222,22 +2097,39 @@
             <w:tcW w:w="8500" w:type="dxa"/>
           </w:tcPr>
           <w:p>
-            <w:pPr>
-              <w:jc w:val="center"/>
-            </w:pPr>
             <w:r>
-              <w:rPr>
-                <w:i/>
-                <w:color w:val="808080"/>
-              </w:rPr>
-              <w:br/>
-              <w:br/>
-              <w:t>[ Ảnh chụp kết quả câu 6 ]</w:t>
-              <w:br/>
-              <w:br/>
-              <w:t>Chèn ảnh: Insert → Picture → From File</w:t>
-              <w:br/>
-              <w:br/>
+              <w:drawing>
+                <wp:inline xmlns:a="http://schemas.openxmlformats.org/drawingml/2006/main" xmlns:pic="http://schemas.openxmlformats.org/drawingml/2006/picture">
+                  <wp:extent cx="5486400" cy="4987636"/>
+                  <wp:docPr id="6" name="Picture 6"/>
+                  <wp:cNvGraphicFramePr>
+                    <a:graphicFrameLocks noChangeAspect="1"/>
+                  </wp:cNvGraphicFramePr>
+                  <a:graphic>
+                    <a:graphicData uri="http://schemas.openxmlformats.org/drawingml/2006/picture">
+                      <pic:pic>
+                        <pic:nvPicPr>
+                          <pic:cNvPr id="0" name="cau6_eeg.png"/>
+                          <pic:cNvPicPr/>
+                        </pic:nvPicPr>
+                        <pic:blipFill>
+                          <a:blip r:embed="rId14"/>
+                          <a:stretch>
+                            <a:fillRect/>
+                          </a:stretch>
+                        </pic:blipFill>
+                        <pic:spPr>
+                          <a:xfrm>
+                            <a:off x="0" y="0"/>
+                            <a:ext cx="5486400" cy="4987636"/>
+                          </a:xfrm>
+                          <a:prstGeom prst="rect"/>
+                        </pic:spPr>
+                      </pic:pic>
+                    </a:graphicData>
+                  </a:graphic>
+                </wp:inline>
+              </w:drawing>
             </w:r>
           </w:p>
         </w:tc>
@@ -2504,76 +2396,6 @@
         </w:rPr>
         <w:t>Chụp toàn bộ figure đầu ra. Đảm bảo rõ trục, tiêu đề, legend.</w:t>
       </w:r>
-      <w:r>
-        <w:br/>
-        <w:drawing>
-          <wp:inline xmlns:a="http://schemas.openxmlformats.org/drawingml/2006/main" xmlns:pic="http://schemas.openxmlformats.org/drawingml/2006/picture">
-            <wp:extent cx="5486400" cy="1828800"/>
-            <wp:docPr id="7" name="Picture 7"/>
-            <wp:cNvGraphicFramePr>
-              <a:graphicFrameLocks noChangeAspect="1"/>
-            </wp:cNvGraphicFramePr>
-            <a:graphic>
-              <a:graphicData uri="http://schemas.openxmlformats.org/drawingml/2006/picture">
-                <pic:pic>
-                  <pic:nvPicPr>
-                    <pic:cNvPr id="0" name="cau7_pho_anh.png"/>
-                    <pic:cNvPicPr/>
-                  </pic:nvPicPr>
-                  <pic:blipFill>
-                    <a:blip r:embed="rId15"/>
-                    <a:stretch>
-                      <a:fillRect/>
-                    </a:stretch>
-                  </pic:blipFill>
-                  <pic:spPr>
-                    <a:xfrm>
-                      <a:off x="0" y="0"/>
-                      <a:ext cx="5486400" cy="1828800"/>
-                    </a:xfrm>
-                    <a:prstGeom prst="rect"/>
-                  </pic:spPr>
-                </pic:pic>
-              </a:graphicData>
-            </a:graphic>
-          </wp:inline>
-        </w:drawing>
-      </w:r>
-      <w:r>
-        <w:br/>
-        <w:drawing>
-          <wp:inline xmlns:a="http://schemas.openxmlformats.org/drawingml/2006/main" xmlns:pic="http://schemas.openxmlformats.org/drawingml/2006/picture">
-            <wp:extent cx="5486400" cy="6583680"/>
-            <wp:docPr id="8" name="Picture 8"/>
-            <wp:cNvGraphicFramePr>
-              <a:graphicFrameLocks noChangeAspect="1"/>
-            </wp:cNvGraphicFramePr>
-            <a:graphic>
-              <a:graphicData uri="http://schemas.openxmlformats.org/drawingml/2006/picture">
-                <pic:pic>
-                  <pic:nvPicPr>
-                    <pic:cNvPr id="0" name="cau7_loc_anh.png"/>
-                    <pic:cNvPicPr/>
-                  </pic:nvPicPr>
-                  <pic:blipFill>
-                    <a:blip r:embed="rId16"/>
-                    <a:stretch>
-                      <a:fillRect/>
-                    </a:stretch>
-                  </pic:blipFill>
-                  <pic:spPr>
-                    <a:xfrm>
-                      <a:off x="0" y="0"/>
-                      <a:ext cx="5486400" cy="6583680"/>
-                    </a:xfrm>
-                    <a:prstGeom prst="rect"/>
-                  </pic:spPr>
-                </pic:pic>
-              </a:graphicData>
-            </a:graphic>
-          </wp:inline>
-        </w:drawing>
-      </w:r>
     </w:p>
     <w:tbl>
       <w:tblPr>
@@ -2591,22 +2413,75 @@
             <w:tcW w:w="8500" w:type="dxa"/>
           </w:tcPr>
           <w:p>
-            <w:pPr>
-              <w:jc w:val="center"/>
-            </w:pPr>
             <w:r>
-              <w:rPr>
-                <w:i/>
-                <w:color w:val="808080"/>
-              </w:rPr>
-              <w:br/>
-              <w:br/>
-              <w:t>[ Ảnh chụp kết quả câu 7 ]</w:t>
-              <w:br/>
-              <w:br/>
-              <w:t>Chèn ảnh: Insert → Picture → From File</w:t>
-              <w:br/>
-              <w:br/>
+              <w:drawing>
+                <wp:inline xmlns:a="http://schemas.openxmlformats.org/drawingml/2006/main" xmlns:pic="http://schemas.openxmlformats.org/drawingml/2006/picture">
+                  <wp:extent cx="5486400" cy="1828800"/>
+                  <wp:docPr id="7" name="Picture 7"/>
+                  <wp:cNvGraphicFramePr>
+                    <a:graphicFrameLocks noChangeAspect="1"/>
+                  </wp:cNvGraphicFramePr>
+                  <a:graphic>
+                    <a:graphicData uri="http://schemas.openxmlformats.org/drawingml/2006/picture">
+                      <pic:pic>
+                        <pic:nvPicPr>
+                          <pic:cNvPr id="0" name="cau7_pho_anh.png"/>
+                          <pic:cNvPicPr/>
+                        </pic:nvPicPr>
+                        <pic:blipFill>
+                          <a:blip r:embed="rId15"/>
+                          <a:stretch>
+                            <a:fillRect/>
+                          </a:stretch>
+                        </pic:blipFill>
+                        <pic:spPr>
+                          <a:xfrm>
+                            <a:off x="0" y="0"/>
+                            <a:ext cx="5486400" cy="1828800"/>
+                          </a:xfrm>
+                          <a:prstGeom prst="rect"/>
+                        </pic:spPr>
+                      </pic:pic>
+                    </a:graphicData>
+                  </a:graphic>
+                </wp:inline>
+              </w:drawing>
+            </w:r>
+          </w:p>
+          <w:p>
+            <w:r>
+              <w:drawing>
+                <wp:inline xmlns:a="http://schemas.openxmlformats.org/drawingml/2006/main" xmlns:pic="http://schemas.openxmlformats.org/drawingml/2006/picture">
+                  <wp:extent cx="5486400" cy="6583680"/>
+                  <wp:docPr id="8" name="Picture 8"/>
+                  <wp:cNvGraphicFramePr>
+                    <a:graphicFrameLocks noChangeAspect="1"/>
+                  </wp:cNvGraphicFramePr>
+                  <a:graphic>
+                    <a:graphicData uri="http://schemas.openxmlformats.org/drawingml/2006/picture">
+                      <pic:pic>
+                        <pic:nvPicPr>
+                          <pic:cNvPr id="0" name="cau7_loc_anh.png"/>
+                          <pic:cNvPicPr/>
+                        </pic:nvPicPr>
+                        <pic:blipFill>
+                          <a:blip r:embed="rId16"/>
+                          <a:stretch>
+                            <a:fillRect/>
+                          </a:stretch>
+                        </pic:blipFill>
+                        <pic:spPr>
+                          <a:xfrm>
+                            <a:off x="0" y="0"/>
+                            <a:ext cx="5486400" cy="6583680"/>
+                          </a:xfrm>
+                          <a:prstGeom prst="rect"/>
+                        </pic:spPr>
+                      </pic:pic>
+                    </a:graphicData>
+                  </a:graphic>
+                </wp:inline>
+              </w:drawing>
             </w:r>
           </w:p>
         </w:tc>

</xml_diff>

<commit_message>
Dien noi dung 3 muc cua phan Ket luan va bai hoc rut ra
</commit_message>
<xml_diff>
--- a/DSP_BienDoiFourier_BaoCao_HoanChinh.docx
+++ b/DSP_BienDoiFourier_BaoCao_HoanChinh.docx
@@ -2577,7 +2577,7 @@
         <w:rPr>
           <w:sz w:val="22"/>
         </w:rPr>
-        <w:t>Đọc ảnh Lenna.png, chuyển grayscale bằng trung bình 3 kênh, tính FFT 2D và shift DC về tâm. Vẽ log|FFT2| và pha. Thiết kế bộ lọc Gauss 2D với 3 mức σ = [0.05, 0.10, 0.20]. Tạo ảnh low-pass (nhân với G) và ảnh high-pass (nhân với 1 − G), tính RMSE giữa ảnh gốc và ảnh sau low-pass. Vẽ bảng 3×2 hiển thị các kết quả và bàn luận lượng thông tin mất đi.</w:t>
+        <w:t>Qua 7 câu kiểm tra, em đã nắm vững quy trình phân tích Fourier từ cài đặt thuật toán nền tảng (DFT vòng lặp, chuẩn hoá biên độ Hermitian, hiểu vì sao phải nhân 2 các bin không phải DC/Nyquist) đến ứng dụng thực tiễn (lọc tuyến tính trong miền tần số, STFT cho tín hiệu không dừng, phân tích phổ EEG sinh lý, lọc ảnh 2D bằng Gauss). Hai kết quả định lượng quan trọng: (i) FFT scipy nhanh hơn DFT vòng lặp khoảng 12000 lần tại N = 8000, khẳng định giá trị của thuật toán Cooley–Tukey và mức ý nghĩa thực tiễn của O(N log N) so với O(N²); (ii) bộ lọc Gauss bandpass đơn giản cải thiện SNR khoảng 30 dB chỉ bằng phép nhân điểm trong miền tần số rồi IFFT, minh hoạ sức mạnh của định lý tích chập.</w:t>
       </w:r>
     </w:p>
     <w:p>
@@ -2593,19 +2593,21 @@
         <w:rPr>
           <w:sz w:val="22"/>
         </w:rPr>
-        <w:t>Bước 1: Đọc ảnh Lenna grayscale 512×512 — chuyển grayscale bằng trung bình 3 kênh RGB theo đúng yêu cầu đề.</w:t>
-        <w:br/>
-        <w:t>Bước 2: FFT 2D bằng sfft.fft2 rồi fftshift để DC về tâm. Vẽ log|FFT2| và pha (pha hiển thị bằng colormap hsv để dải tuần hoàn rõ).</w:t>
-        <w:br/>
-        <w:t>Bước 3: Tạo lưới toạ độ z-score chuẩn hoá: xr = zscore(arange(W)), yr = zscore(arange(H)), meshgrid để có ma trận (X, Y) toạ độ chuẩn.</w:t>
-        <w:br/>
-        <w:t>Bước 4: Với mỗi σ ∈ {0.05, 0.10, 0.20}: tính G(u, v) = exp(−(u² + v²)/(2σ²)).</w:t>
-        <w:br/>
-        <w:t>Bước 5: Lọc thông thấp F·G; lọc thông cao F·(1 − G). Khôi phục ảnh: ifftshift rồi ifft2 và lấy phần thực.</w:t>
-        <w:br/>
-        <w:t>Bước 6: Tính RMSE = sqrt(mean((I − I_lp)²)) và phần trăm năng lượng giữ lại sau low-pass.</w:t>
-        <w:br/>
-        <w:t>Bước 7: Hiển thị bảng 3×2 (3 σ × 2 loại lọc).</w:t>
+        <w:t>- Cài đặt DFT và STFT từ vòng lặp, hiểu rõ cách chuẩn hoá biên độ và tính đối xứng Hermitian của phổ tín hiệu thực.</w:t>
+        <w:br/>
+        <w:t>- Sử dụng thành thạo các thư viện scipy.fftpack (fft, ifft, fftshift), scipy.signal (welch, hann window), scipy.io (loadmat đọc file .mat), PIL (đọc ảnh).</w:t>
+        <w:br/>
+        <w:t>- Hiểu định lý Nyquist, hiện tượng gập phổ (aliasing), và vai trò của bộ lọc anti-aliasing trước ADC.</w:t>
+        <w:br/>
+        <w:t>- Áp dụng định lý tích chập cho lọc tuyến tính trong miền tần số; hiểu lý do cửa sổ Gauss tốt hơn cắt cứng (tránh hiệu ứng Gibbs / ringing).</w:t>
+        <w:br/>
+        <w:t>- Đánh giá sự đánh đổi Heisenberg trong phân tích thời gian–tần số khi chọn kích thước cửa sổ STFT.</w:t>
+        <w:br/>
+        <w:t>- Đọc và diễn giải tín hiệu y sinh (EEG) theo 5 băng tần sinh lý Delta/Theta/Alpha/Beta/Gamma, giải thích cơ chế alpha blocking tại vùng chẩm.</w:t>
+        <w:br/>
+        <w:t>- Áp dụng FFT 2D vào xử lý ảnh, hiểu vai trò của log|FFT2|, pha, và cách thiết kế bộ lọc Gauss 2D cho low-pass / high-pass.</w:t>
+        <w:br/>
+        <w:t>- Trình bày báo cáo khoa học có cấu trúc, kèm hình ảnh có chú thích đầy đủ và phân tích định lượng (RMSE, SNR, % năng lượng).</w:t>
       </w:r>
     </w:p>
     <w:p>
@@ -2619,11 +2621,21 @@
     <w:p>
       <w:r>
         <w:rPr>
-          <w:i/>
-          <w:color w:val="808080"/>
           <w:sz w:val="22"/>
         </w:rPr>
-        <w:t>[Nêu các kỹ thuật mà sinh viên muốn tìm hiểu thêm sau bài kiểm tra: wavelet, EMD, biến đổi Hilbert-Huang, học máy với đặc trưng phổ...]</w:t>
+        <w:t>- Wavelet và Continuous Wavelet Transform (CWT): phân giải thời gian–tần số đa thang đo, vượt giới hạn STFT có Δt cố định. Wavelet Morlet và Mexican hat thường dùng trong EEG, ECG.</w:t>
+        <w:br/>
+        <w:t>- Biến đổi Hilbert và Hilbert–Huang Transform (HHT): phân tích biên độ/pha tức thời cho tín hiệu phi tuyến và không dừng. EMD (Empirical Mode Decomposition) là tiền xử lý quan trọng trong HHT.</w:t>
+        <w:br/>
+        <w:t>- Spectral estimation nâng cao: Multitaper (Thomson), AR/Burg, MUSIC, ESPRIT — cho phép ước lượng tần số với độ phân giải siêu cao trong khi N hữu hạn.</w:t>
+        <w:br/>
+        <w:t>- Lọc thích nghi (adaptive filtering): LMS, NLMS, RLS — bộ lọc tự cập nhật theo dữ liệu thay vì hệ số cố định; ứng dụng khử echo, beamforming, equalization kênh truyền.</w:t>
+        <w:br/>
+        <w:t>- Học máy với đặc trưng phổ: dùng STFT, CWT, mel-spectrogram làm input cho CNN trong nhận dạng âm thanh, BCI từ EEG, phát hiện lỗi vibration.</w:t>
+        <w:br/>
+        <w:t>- Xử lý ảnh nâng cao trong miền tần số: lọc homomorphic (tách bóng / phản xạ), bộ lọc Butterworth, Wiener; ứng dụng phục hồi ảnh, khử nhiễu MRI/CT.</w:t>
+        <w:br/>
+        <w:t>- Xử lý đa kênh EEG: ICA (Independent Component Analysis) tách nguồn, source localization với LORETA/sLORETA, connectivity analysis với coherence và phase locking value (PLV).</w:t>
       </w:r>
     </w:p>
     <w:p>

</xml_diff>